<commit_message>
TS 2.6 Tamil Kramam only
</commit_message>
<xml_diff>
--- a/TS-Kramam/TS-2.6/TS 2.6 Tamil Krama Paatam Corrections.docx
+++ b/TS-Kramam/TS-2.6/TS 2.6 Tamil Krama Paatam Corrections.docx
@@ -51,17 +51,7 @@
           <w:szCs w:val="32"/>
           <w:u w:val="single"/>
         </w:rPr>
-        <w:t xml:space="preserve">2.6 </w:t>
-      </w:r>
-      <w:r>
-        <w:rPr>
-          <w:b/>
-          <w:bCs/>
-          <w:sz w:val="32"/>
-          <w:szCs w:val="32"/>
-          <w:u w:val="single"/>
-        </w:rPr>
-        <w:t xml:space="preserve">Tamil </w:t>
+        <w:t xml:space="preserve">2.6 Tamil </w:t>
       </w:r>
       <w:r>
         <w:rPr>
@@ -130,12 +120,16 @@
               <w:spacing w:before="0" w:line="240" w:lineRule="auto"/>
               <w:jc w:val="center"/>
               <w:rPr>
+                <w:b/>
+                <w:bCs/>
                 <w:sz w:val="32"/>
                 <w:szCs w:val="32"/>
               </w:rPr>
             </w:pPr>
             <w:r>
               <w:rPr>
+                <w:b/>
+                <w:bCs/>
                 <w:sz w:val="32"/>
                 <w:szCs w:val="32"/>
               </w:rPr>
@@ -147,12 +141,16 @@
               <w:spacing w:before="0" w:line="240" w:lineRule="auto"/>
               <w:jc w:val="center"/>
               <w:rPr>
+                <w:b/>
+                <w:bCs/>
                 <w:sz w:val="32"/>
                 <w:szCs w:val="32"/>
               </w:rPr>
             </w:pPr>
             <w:r>
               <w:rPr>
+                <w:b/>
+                <w:bCs/>
                 <w:sz w:val="32"/>
                 <w:szCs w:val="32"/>
               </w:rPr>
@@ -169,12 +167,16 @@
               <w:spacing w:before="0" w:line="240" w:lineRule="auto"/>
               <w:jc w:val="center"/>
               <w:rPr>
+                <w:b/>
+                <w:bCs/>
                 <w:sz w:val="32"/>
                 <w:szCs w:val="32"/>
               </w:rPr>
             </w:pPr>
             <w:r>
               <w:rPr>
+                <w:b/>
+                <w:bCs/>
                 <w:sz w:val="32"/>
                 <w:szCs w:val="32"/>
               </w:rPr>
@@ -192,12 +194,16 @@
               <w:ind w:right="-18"/>
               <w:jc w:val="center"/>
               <w:rPr>
+                <w:b/>
+                <w:bCs/>
                 <w:sz w:val="32"/>
                 <w:szCs w:val="32"/>
               </w:rPr>
             </w:pPr>
             <w:r>
               <w:rPr>
+                <w:b/>
+                <w:bCs/>
                 <w:sz w:val="32"/>
                 <w:szCs w:val="32"/>
               </w:rPr>
@@ -860,43 +866,3780 @@
           </w:p>
         </w:tc>
       </w:tr>
+      <w:tr>
+        <w:trPr>
+          <w:trHeight w:val="1091"/>
+        </w:trPr>
+        <w:tc>
+          <w:tcPr>
+            <w:tcW w:w="4048" w:type="dxa"/>
+          </w:tcPr>
+          <w:p>
+            <w:pPr>
+              <w:widowControl w:val="0"/>
+              <w:tabs>
+                <w:tab w:val="left" w:pos="993"/>
+              </w:tabs>
+              <w:autoSpaceDE w:val="0"/>
+              <w:autoSpaceDN w:val="0"/>
+              <w:adjustRightInd w:val="0"/>
+              <w:spacing w:before="0" w:line="240" w:lineRule="auto"/>
+              <w:ind w:right="297"/>
+              <w:rPr>
+                <w:rFonts w:cs="Arial"/>
+                <w:b/>
+                <w:color w:val="000000"/>
+                <w:sz w:val="28"/>
+                <w:szCs w:val="32"/>
+              </w:rPr>
+            </w:pPr>
+            <w:r>
+              <w:rPr>
+                <w:rFonts w:cs="Arial"/>
+                <w:b/>
+                <w:color w:val="000000"/>
+                <w:sz w:val="28"/>
+                <w:szCs w:val="32"/>
+              </w:rPr>
+              <w:t>T.S.2.</w:t>
+            </w:r>
+            <w:r>
+              <w:rPr>
+                <w:rFonts w:cs="Arial"/>
+                <w:b/>
+                <w:color w:val="000000"/>
+                <w:sz w:val="28"/>
+                <w:szCs w:val="32"/>
+              </w:rPr>
+              <w:t>6.4</w:t>
+            </w:r>
+            <w:r>
+              <w:rPr>
+                <w:rFonts w:cs="Arial"/>
+                <w:b/>
+                <w:color w:val="000000"/>
+                <w:sz w:val="28"/>
+                <w:szCs w:val="32"/>
+              </w:rPr>
+              <w:t>.1</w:t>
+            </w:r>
+            <w:r>
+              <w:rPr>
+                <w:rFonts w:cs="Arial"/>
+                <w:b/>
+                <w:color w:val="000000"/>
+                <w:sz w:val="28"/>
+                <w:szCs w:val="32"/>
+              </w:rPr>
+              <w:t xml:space="preserve"> </w:t>
+            </w:r>
+            <w:r>
+              <w:rPr>
+                <w:rFonts w:cs="Arial"/>
+                <w:b/>
+                <w:color w:val="000000"/>
+                <w:sz w:val="28"/>
+                <w:szCs w:val="32"/>
+              </w:rPr>
+              <w:t>– Kramam</w:t>
+            </w:r>
+          </w:p>
+          <w:p>
+            <w:pPr>
+              <w:widowControl w:val="0"/>
+              <w:tabs>
+                <w:tab w:val="left" w:pos="993"/>
+              </w:tabs>
+              <w:autoSpaceDE w:val="0"/>
+              <w:autoSpaceDN w:val="0"/>
+              <w:adjustRightInd w:val="0"/>
+              <w:spacing w:before="0" w:line="240" w:lineRule="auto"/>
+              <w:ind w:right="297"/>
+              <w:rPr>
+                <w:rFonts w:cs="Arial"/>
+                <w:b/>
+                <w:color w:val="000000"/>
+                <w:sz w:val="28"/>
+                <w:szCs w:val="32"/>
+              </w:rPr>
+            </w:pPr>
+            <w:r>
+              <w:rPr>
+                <w:rFonts w:cs="Arial"/>
+                <w:b/>
+                <w:color w:val="000000"/>
+                <w:sz w:val="28"/>
+                <w:szCs w:val="32"/>
+              </w:rPr>
+              <w:t>Krama Vaakyam No.-</w:t>
+            </w:r>
+            <w:r>
+              <w:rPr>
+                <w:rFonts w:cs="Arial"/>
+                <w:b/>
+                <w:color w:val="000000"/>
+                <w:sz w:val="28"/>
+                <w:szCs w:val="32"/>
+              </w:rPr>
+              <w:t xml:space="preserve"> </w:t>
+            </w:r>
+            <w:r>
+              <w:rPr>
+                <w:rFonts w:cs="Arial"/>
+                <w:b/>
+                <w:color w:val="000000"/>
+                <w:sz w:val="28"/>
+                <w:szCs w:val="32"/>
+              </w:rPr>
+              <w:t>4</w:t>
+            </w:r>
+            <w:r>
+              <w:rPr>
+                <w:rFonts w:cs="Arial"/>
+                <w:b/>
+                <w:color w:val="000000"/>
+                <w:sz w:val="28"/>
+                <w:szCs w:val="32"/>
+              </w:rPr>
+              <w:t>1</w:t>
+            </w:r>
+          </w:p>
+          <w:p>
+            <w:pPr>
+              <w:widowControl w:val="0"/>
+              <w:tabs>
+                <w:tab w:val="left" w:pos="993"/>
+              </w:tabs>
+              <w:autoSpaceDE w:val="0"/>
+              <w:autoSpaceDN w:val="0"/>
+              <w:adjustRightInd w:val="0"/>
+              <w:spacing w:before="0" w:line="240" w:lineRule="auto"/>
+              <w:ind w:right="297"/>
+              <w:rPr>
+                <w:rFonts w:cs="Arial"/>
+                <w:b/>
+                <w:color w:val="000000"/>
+                <w:sz w:val="28"/>
+                <w:szCs w:val="28"/>
+              </w:rPr>
+            </w:pPr>
+            <w:r>
+              <w:rPr>
+                <w:rFonts w:cs="Arial"/>
+                <w:b/>
+                <w:color w:val="000000"/>
+                <w:sz w:val="28"/>
+                <w:szCs w:val="32"/>
+              </w:rPr>
+              <w:t>Panchaati No</w:t>
+            </w:r>
+            <w:r>
+              <w:rPr>
+                <w:rFonts w:cs="Arial"/>
+                <w:b/>
+                <w:color w:val="000000"/>
+                <w:szCs w:val="32"/>
+              </w:rPr>
+              <w:t>. -</w:t>
+            </w:r>
+            <w:r>
+              <w:rPr>
+                <w:rFonts w:cs="Arial"/>
+                <w:b/>
+                <w:color w:val="000000"/>
+                <w:szCs w:val="32"/>
+              </w:rPr>
+              <w:t xml:space="preserve"> </w:t>
+            </w:r>
+            <w:r>
+              <w:rPr>
+                <w:rFonts w:cs="Arial"/>
+                <w:b/>
+                <w:color w:val="000000"/>
+                <w:sz w:val="28"/>
+                <w:szCs w:val="28"/>
+              </w:rPr>
+              <w:t>20</w:t>
+            </w:r>
+          </w:p>
+        </w:tc>
+        <w:tc>
+          <w:tcPr>
+            <w:tcW w:w="5386" w:type="dxa"/>
+          </w:tcPr>
+          <w:p>
+            <w:pPr>
+              <w:widowControl w:val="0"/>
+              <w:autoSpaceDE w:val="0"/>
+              <w:autoSpaceDN w:val="0"/>
+              <w:adjustRightInd w:val="0"/>
+              <w:spacing w:before="0" w:line="240" w:lineRule="auto"/>
+              <w:rPr>
+                <w:rFonts w:ascii="Latha" w:hAnsi="Latha" w:cs="Latha"/>
+                <w:sz w:val="28"/>
+                <w:szCs w:val="28"/>
+                <w:cs/>
+                <w:lang w:bidi="ta-IN"/>
+              </w:rPr>
+            </w:pPr>
+            <w:r>
+              <w:rPr>
+                <w:rFonts w:ascii="Latha" w:hAnsi="Latha" w:cs="Latha"/>
+                <w:sz w:val="28"/>
+                <w:szCs w:val="28"/>
+                <w:cs/>
+                <w:lang w:bidi="ta-IN"/>
+              </w:rPr>
+              <w:t>ஶ்ய</w:t>
+            </w:r>
+            <w:r>
+              <w:rPr>
+                <w:rFonts w:ascii="BRH Tamil Tab Extra" w:hAnsi="BRH Tamil Tab Extra" w:cs="Latha"/>
+                <w:b/>
+                <w:sz w:val="32"/>
+                <w:szCs w:val="28"/>
+                <w:lang w:bidi="ta-IN"/>
+              </w:rPr>
+              <w:t>…</w:t>
+            </w:r>
+            <w:r>
+              <w:rPr>
+                <w:rFonts w:ascii="Latha" w:hAnsi="Latha" w:cs="Latha"/>
+                <w:sz w:val="28"/>
+                <w:szCs w:val="28"/>
+                <w:cs/>
+                <w:lang w:bidi="ta-IN"/>
+              </w:rPr>
+              <w:t>தி</w:t>
+            </w:r>
+            <w:r>
+              <w:rPr>
+                <w:rFonts w:ascii="BRH Tamil Tab Extra" w:hAnsi="BRH Tamil Tab Extra" w:cs="Latha"/>
+                <w:b/>
+                <w:sz w:val="32"/>
+                <w:szCs w:val="28"/>
+                <w:lang w:bidi="ta-IN"/>
+              </w:rPr>
+              <w:t>…</w:t>
+            </w:r>
+            <w:r>
+              <w:rPr>
+                <w:rFonts w:ascii="Latha" w:hAnsi="Latha" w:cs="Latha"/>
+                <w:sz w:val="28"/>
+                <w:szCs w:val="28"/>
+                <w:lang w:bidi="ta-IN"/>
+              </w:rPr>
+              <w:t xml:space="preserve"> </w:t>
+            </w:r>
+            <w:r>
+              <w:rPr>
+                <w:rFonts w:ascii="Latha" w:hAnsi="Latha" w:cs="Latha"/>
+                <w:sz w:val="28"/>
+                <w:szCs w:val="28"/>
+                <w:cs/>
+                <w:lang w:bidi="ta-IN"/>
+              </w:rPr>
+              <w:t>ப்</w:t>
+            </w:r>
+            <w:r>
+              <w:rPr>
+                <w:rFonts w:ascii="Latha" w:hAnsi="Latha" w:cs="Latha"/>
+                <w:b/>
+                <w:bCs/>
+                <w:position w:val="-12"/>
+                <w:sz w:val="28"/>
+                <w:szCs w:val="28"/>
+                <w:cs/>
+                <w:lang w:bidi="ta-IN"/>
+              </w:rPr>
+              <w:t>4</w:t>
+            </w:r>
+            <w:r>
+              <w:rPr>
+                <w:rFonts w:ascii="Latha" w:hAnsi="Latha" w:cs="Latha"/>
+                <w:sz w:val="28"/>
+                <w:szCs w:val="28"/>
+                <w:cs/>
+                <w:lang w:bidi="ta-IN"/>
+              </w:rPr>
+              <w:t>ராத்</w:t>
+            </w:r>
+            <w:r>
+              <w:rPr>
+                <w:rFonts w:ascii="Latha" w:hAnsi="Latha" w:cs="Latha"/>
+                <w:b/>
+                <w:bCs/>
+                <w:i/>
+                <w:iCs/>
+                <w:sz w:val="28"/>
+                <w:szCs w:val="28"/>
+                <w:cs/>
+                <w:lang w:bidi="ta-IN"/>
+              </w:rPr>
+              <w:t>ரு</w:t>
+            </w:r>
+            <w:r>
+              <w:rPr>
+                <w:rFonts w:ascii="BRH Tamil Tab Extra" w:hAnsi="BRH Tamil Tab Extra" w:cs="Latha"/>
+                <w:b/>
+                <w:sz w:val="36"/>
+                <w:szCs w:val="28"/>
+                <w:lang w:bidi="ta-IN"/>
+              </w:rPr>
+              <w:t>†</w:t>
+            </w:r>
+            <w:r>
+              <w:rPr>
+                <w:rFonts w:ascii="Latha" w:hAnsi="Latha" w:cs="Latha"/>
+                <w:sz w:val="28"/>
+                <w:szCs w:val="28"/>
+                <w:cs/>
+                <w:lang w:bidi="ta-IN"/>
+              </w:rPr>
+              <w:t xml:space="preserve">வ்யாய </w:t>
+            </w:r>
+            <w:r>
+              <w:rPr>
+                <w:rFonts w:ascii="Latha" w:hAnsi="Latha" w:cs="Latha"/>
+                <w:sz w:val="28"/>
+                <w:szCs w:val="28"/>
+                <w:lang w:bidi="ta-IN"/>
+              </w:rPr>
+              <w:t xml:space="preserve">| </w:t>
+            </w:r>
+            <w:r>
+              <w:rPr>
+                <w:rFonts w:ascii="Latha" w:hAnsi="Latha" w:cs="Latha"/>
+                <w:sz w:val="28"/>
+                <w:szCs w:val="28"/>
+                <w:highlight w:val="yellow"/>
+                <w:cs/>
+                <w:lang w:bidi="ta-IN"/>
+              </w:rPr>
+              <w:t>பா</w:t>
+            </w:r>
+            <w:r>
+              <w:rPr>
+                <w:rFonts w:ascii="BRH Tamil Tab Extra" w:hAnsi="BRH Tamil Tab Extra" w:cs="Latha"/>
+                <w:b/>
+                <w:sz w:val="36"/>
+                <w:szCs w:val="28"/>
+                <w:highlight w:val="yellow"/>
+                <w:lang w:bidi="ta-IN"/>
+              </w:rPr>
+              <w:t>†</w:t>
+            </w:r>
+            <w:r>
+              <w:rPr>
+                <w:rFonts w:ascii="Latha" w:hAnsi="Latha" w:cs="Latha"/>
+                <w:b/>
+                <w:bCs/>
+                <w:position w:val="-12"/>
+                <w:sz w:val="28"/>
+                <w:szCs w:val="28"/>
+                <w:highlight w:val="yellow"/>
+                <w:cs/>
+                <w:lang w:bidi="ta-IN"/>
+              </w:rPr>
+              <w:t>4</w:t>
+            </w:r>
+            <w:r>
+              <w:rPr>
+                <w:rFonts w:ascii="Latha" w:hAnsi="Latha" w:cs="Latha"/>
+                <w:sz w:val="28"/>
+                <w:szCs w:val="28"/>
+                <w:highlight w:val="yellow"/>
+                <w:cs/>
+                <w:lang w:bidi="ta-IN"/>
+              </w:rPr>
+              <w:t>த்</w:t>
+            </w:r>
+            <w:r>
+              <w:rPr>
+                <w:rFonts w:ascii="Latha" w:hAnsi="Latha" w:cs="Latha"/>
+                <w:b/>
+                <w:bCs/>
+                <w:i/>
+                <w:iCs/>
+                <w:sz w:val="28"/>
+                <w:szCs w:val="28"/>
+                <w:cs/>
+                <w:lang w:bidi="ta-IN"/>
+              </w:rPr>
+              <w:t>ரு</w:t>
+            </w:r>
+            <w:r>
+              <w:rPr>
+                <w:rFonts w:ascii="Latha" w:hAnsi="Latha" w:cs="Latha"/>
+                <w:sz w:val="28"/>
+                <w:szCs w:val="28"/>
+                <w:cs/>
+                <w:lang w:bidi="ta-IN"/>
+              </w:rPr>
+              <w:t>வ்யாய ப்ரஹரி</w:t>
+            </w:r>
+            <w:r>
+              <w:rPr>
+                <w:rFonts w:ascii="BRH Tamil Tab Extra" w:hAnsi="BRH Tamil Tab Extra" w:cs="Latha"/>
+                <w:b/>
+                <w:sz w:val="32"/>
+                <w:szCs w:val="28"/>
+                <w:lang w:bidi="ta-IN"/>
+              </w:rPr>
+              <w:t>…</w:t>
+            </w:r>
+            <w:r>
+              <w:rPr>
+                <w:rFonts w:ascii="Latha" w:hAnsi="Latha" w:cs="Latha"/>
+                <w:sz w:val="28"/>
+                <w:szCs w:val="28"/>
+                <w:cs/>
+                <w:lang w:bidi="ta-IN"/>
+              </w:rPr>
+              <w:t xml:space="preserve">ஷ்யன்ன் </w:t>
+            </w:r>
+            <w:r>
+              <w:rPr>
+                <w:rFonts w:ascii="Latha" w:hAnsi="Latha" w:cs="Latha"/>
+                <w:sz w:val="28"/>
+                <w:szCs w:val="28"/>
+                <w:lang w:bidi="ta-IN"/>
+              </w:rPr>
+              <w:t>|</w:t>
+            </w:r>
+          </w:p>
+        </w:tc>
+        <w:tc>
+          <w:tcPr>
+            <w:tcW w:w="5220" w:type="dxa"/>
+          </w:tcPr>
+          <w:p>
+            <w:pPr>
+              <w:widowControl w:val="0"/>
+              <w:autoSpaceDE w:val="0"/>
+              <w:autoSpaceDN w:val="0"/>
+              <w:adjustRightInd w:val="0"/>
+              <w:spacing w:before="0" w:line="240" w:lineRule="auto"/>
+              <w:rPr>
+                <w:rFonts w:ascii="Latha" w:hAnsi="Latha" w:cs="Latha"/>
+                <w:sz w:val="28"/>
+                <w:szCs w:val="28"/>
+                <w:cs/>
+                <w:lang w:bidi="ta-IN"/>
+              </w:rPr>
+            </w:pPr>
+            <w:r>
+              <w:rPr>
+                <w:rFonts w:ascii="Latha" w:hAnsi="Latha" w:cs="Latha"/>
+                <w:sz w:val="28"/>
+                <w:szCs w:val="28"/>
+                <w:cs/>
+                <w:lang w:bidi="ta-IN"/>
+              </w:rPr>
+              <w:t>ஶ்ய</w:t>
+            </w:r>
+            <w:r>
+              <w:rPr>
+                <w:rFonts w:ascii="BRH Tamil Tab Extra" w:hAnsi="BRH Tamil Tab Extra" w:cs="Latha"/>
+                <w:b/>
+                <w:sz w:val="32"/>
+                <w:szCs w:val="28"/>
+                <w:lang w:bidi="ta-IN"/>
+              </w:rPr>
+              <w:t>…</w:t>
+            </w:r>
+            <w:r>
+              <w:rPr>
+                <w:rFonts w:ascii="Latha" w:hAnsi="Latha" w:cs="Latha"/>
+                <w:sz w:val="28"/>
+                <w:szCs w:val="28"/>
+                <w:cs/>
+                <w:lang w:bidi="ta-IN"/>
+              </w:rPr>
+              <w:t>தி</w:t>
+            </w:r>
+            <w:r>
+              <w:rPr>
+                <w:rFonts w:ascii="BRH Tamil Tab Extra" w:hAnsi="BRH Tamil Tab Extra" w:cs="Latha"/>
+                <w:b/>
+                <w:sz w:val="32"/>
+                <w:szCs w:val="28"/>
+                <w:lang w:bidi="ta-IN"/>
+              </w:rPr>
+              <w:t>…</w:t>
+            </w:r>
+            <w:r>
+              <w:rPr>
+                <w:rFonts w:ascii="Latha" w:hAnsi="Latha" w:cs="Latha"/>
+                <w:sz w:val="28"/>
+                <w:szCs w:val="28"/>
+                <w:lang w:bidi="ta-IN"/>
+              </w:rPr>
+              <w:t xml:space="preserve"> </w:t>
+            </w:r>
+            <w:r>
+              <w:rPr>
+                <w:rFonts w:ascii="Latha" w:hAnsi="Latha" w:cs="Latha"/>
+                <w:sz w:val="28"/>
+                <w:szCs w:val="28"/>
+                <w:cs/>
+                <w:lang w:bidi="ta-IN"/>
+              </w:rPr>
+              <w:t>ப்</w:t>
+            </w:r>
+            <w:r>
+              <w:rPr>
+                <w:rFonts w:ascii="Latha" w:hAnsi="Latha" w:cs="Latha"/>
+                <w:b/>
+                <w:bCs/>
+                <w:position w:val="-12"/>
+                <w:sz w:val="28"/>
+                <w:szCs w:val="28"/>
+                <w:cs/>
+                <w:lang w:bidi="ta-IN"/>
+              </w:rPr>
+              <w:t>4</w:t>
+            </w:r>
+            <w:r>
+              <w:rPr>
+                <w:rFonts w:ascii="Latha" w:hAnsi="Latha" w:cs="Latha"/>
+                <w:sz w:val="28"/>
+                <w:szCs w:val="28"/>
+                <w:cs/>
+                <w:lang w:bidi="ta-IN"/>
+              </w:rPr>
+              <w:t>ராத்</w:t>
+            </w:r>
+            <w:r>
+              <w:rPr>
+                <w:rFonts w:ascii="Latha" w:hAnsi="Latha" w:cs="Latha"/>
+                <w:b/>
+                <w:bCs/>
+                <w:i/>
+                <w:iCs/>
+                <w:sz w:val="28"/>
+                <w:szCs w:val="28"/>
+                <w:cs/>
+                <w:lang w:bidi="ta-IN"/>
+              </w:rPr>
+              <w:t>ரு</w:t>
+            </w:r>
+            <w:r>
+              <w:rPr>
+                <w:rFonts w:ascii="BRH Tamil Tab Extra" w:hAnsi="BRH Tamil Tab Extra" w:cs="Latha"/>
+                <w:b/>
+                <w:sz w:val="36"/>
+                <w:szCs w:val="28"/>
+                <w:lang w:bidi="ta-IN"/>
+              </w:rPr>
+              <w:t>†</w:t>
+            </w:r>
+            <w:r>
+              <w:rPr>
+                <w:rFonts w:ascii="Latha" w:hAnsi="Latha" w:cs="Latha"/>
+                <w:sz w:val="28"/>
+                <w:szCs w:val="28"/>
+                <w:cs/>
+                <w:lang w:bidi="ta-IN"/>
+              </w:rPr>
+              <w:t xml:space="preserve">வ்யாய </w:t>
+            </w:r>
+            <w:r>
+              <w:rPr>
+                <w:rFonts w:ascii="Latha" w:hAnsi="Latha" w:cs="Latha"/>
+                <w:sz w:val="28"/>
+                <w:szCs w:val="28"/>
+                <w:lang w:bidi="ta-IN"/>
+              </w:rPr>
+              <w:t xml:space="preserve">| </w:t>
+            </w:r>
+            <w:r>
+              <w:rPr>
+                <w:rFonts w:ascii="Latha" w:hAnsi="Latha" w:cs="Latha"/>
+                <w:sz w:val="28"/>
+                <w:szCs w:val="28"/>
+                <w:highlight w:val="green"/>
+                <w:cs/>
+                <w:lang w:bidi="ta-IN"/>
+              </w:rPr>
+              <w:t>ப்</w:t>
+            </w:r>
+            <w:r>
+              <w:rPr>
+                <w:rFonts w:ascii="Latha" w:hAnsi="Latha" w:cs="Latha"/>
+                <w:b/>
+                <w:bCs/>
+                <w:position w:val="-12"/>
+                <w:sz w:val="28"/>
+                <w:szCs w:val="28"/>
+                <w:highlight w:val="green"/>
+                <w:cs/>
+                <w:lang w:bidi="ta-IN"/>
+              </w:rPr>
+              <w:t>4</w:t>
+            </w:r>
+            <w:r>
+              <w:rPr>
+                <w:rFonts w:ascii="Latha" w:hAnsi="Latha" w:cs="Latha"/>
+                <w:sz w:val="28"/>
+                <w:szCs w:val="28"/>
+                <w:highlight w:val="green"/>
+                <w:cs/>
+                <w:lang w:bidi="ta-IN"/>
+              </w:rPr>
+              <w:t>ராத்</w:t>
+            </w:r>
+            <w:r>
+              <w:rPr>
+                <w:rFonts w:ascii="Latha" w:hAnsi="Latha" w:cs="Latha"/>
+                <w:b/>
+                <w:bCs/>
+                <w:i/>
+                <w:iCs/>
+                <w:sz w:val="28"/>
+                <w:szCs w:val="28"/>
+                <w:highlight w:val="green"/>
+                <w:cs/>
+                <w:lang w:bidi="ta-IN"/>
+              </w:rPr>
+              <w:t>ரு</w:t>
+            </w:r>
+            <w:r>
+              <w:rPr>
+                <w:rFonts w:ascii="BRH Tamil Tab Extra" w:hAnsi="BRH Tamil Tab Extra" w:cs="Latha"/>
+                <w:b/>
+                <w:sz w:val="36"/>
+                <w:szCs w:val="28"/>
+                <w:highlight w:val="green"/>
+                <w:lang w:bidi="ta-IN"/>
+              </w:rPr>
+              <w:t>†</w:t>
+            </w:r>
+            <w:r>
+              <w:rPr>
+                <w:rFonts w:ascii="Latha" w:hAnsi="Latha" w:cs="Latha"/>
+                <w:sz w:val="28"/>
+                <w:szCs w:val="28"/>
+                <w:cs/>
+                <w:lang w:bidi="ta-IN"/>
+              </w:rPr>
+              <w:t>வ்யாய ப்ரஹரி</w:t>
+            </w:r>
+            <w:r>
+              <w:rPr>
+                <w:rFonts w:ascii="BRH Tamil Tab Extra" w:hAnsi="BRH Tamil Tab Extra" w:cs="Latha"/>
+                <w:b/>
+                <w:sz w:val="32"/>
+                <w:szCs w:val="28"/>
+                <w:lang w:bidi="ta-IN"/>
+              </w:rPr>
+              <w:t>…</w:t>
+            </w:r>
+            <w:r>
+              <w:rPr>
+                <w:rFonts w:ascii="Latha" w:hAnsi="Latha" w:cs="Latha"/>
+                <w:sz w:val="28"/>
+                <w:szCs w:val="28"/>
+                <w:cs/>
+                <w:lang w:bidi="ta-IN"/>
+              </w:rPr>
+              <w:t xml:space="preserve">ஷ்யன்ன் </w:t>
+            </w:r>
+          </w:p>
+        </w:tc>
+      </w:tr>
+      <w:tr>
+        <w:trPr>
+          <w:trHeight w:val="1091"/>
+        </w:trPr>
+        <w:tc>
+          <w:tcPr>
+            <w:tcW w:w="4048" w:type="dxa"/>
+          </w:tcPr>
+          <w:p>
+            <w:pPr>
+              <w:widowControl w:val="0"/>
+              <w:tabs>
+                <w:tab w:val="left" w:pos="993"/>
+              </w:tabs>
+              <w:autoSpaceDE w:val="0"/>
+              <w:autoSpaceDN w:val="0"/>
+              <w:adjustRightInd w:val="0"/>
+              <w:spacing w:before="0" w:line="240" w:lineRule="auto"/>
+              <w:ind w:right="297"/>
+              <w:rPr>
+                <w:rFonts w:cs="Arial"/>
+                <w:b/>
+                <w:color w:val="000000"/>
+                <w:sz w:val="28"/>
+                <w:szCs w:val="32"/>
+              </w:rPr>
+            </w:pPr>
+            <w:r>
+              <w:rPr>
+                <w:rFonts w:cs="Arial"/>
+                <w:b/>
+                <w:color w:val="000000"/>
+                <w:sz w:val="28"/>
+                <w:szCs w:val="32"/>
+              </w:rPr>
+              <w:t>T.S.2.</w:t>
+            </w:r>
+            <w:r>
+              <w:rPr>
+                <w:rFonts w:cs="Arial"/>
+                <w:b/>
+                <w:color w:val="000000"/>
+                <w:sz w:val="28"/>
+                <w:szCs w:val="32"/>
+              </w:rPr>
+              <w:t>6.4.</w:t>
+            </w:r>
+            <w:r>
+              <w:rPr>
+                <w:rFonts w:cs="Arial"/>
+                <w:b/>
+                <w:color w:val="000000"/>
+                <w:sz w:val="28"/>
+                <w:szCs w:val="32"/>
+              </w:rPr>
+              <w:t>2</w:t>
+            </w:r>
+            <w:r>
+              <w:rPr>
+                <w:rFonts w:cs="Arial"/>
+                <w:b/>
+                <w:color w:val="000000"/>
+                <w:sz w:val="28"/>
+                <w:szCs w:val="32"/>
+              </w:rPr>
+              <w:t xml:space="preserve"> </w:t>
+            </w:r>
+            <w:r>
+              <w:rPr>
+                <w:rFonts w:cs="Arial"/>
+                <w:b/>
+                <w:color w:val="000000"/>
+                <w:sz w:val="28"/>
+                <w:szCs w:val="32"/>
+              </w:rPr>
+              <w:t>– Kramam</w:t>
+            </w:r>
+          </w:p>
+          <w:p>
+            <w:pPr>
+              <w:widowControl w:val="0"/>
+              <w:tabs>
+                <w:tab w:val="left" w:pos="993"/>
+              </w:tabs>
+              <w:autoSpaceDE w:val="0"/>
+              <w:autoSpaceDN w:val="0"/>
+              <w:adjustRightInd w:val="0"/>
+              <w:spacing w:before="0" w:line="240" w:lineRule="auto"/>
+              <w:ind w:right="297"/>
+              <w:rPr>
+                <w:rFonts w:cs="Arial"/>
+                <w:b/>
+                <w:color w:val="000000"/>
+                <w:sz w:val="28"/>
+                <w:szCs w:val="32"/>
+              </w:rPr>
+            </w:pPr>
+            <w:r>
+              <w:rPr>
+                <w:rFonts w:cs="Arial"/>
+                <w:b/>
+                <w:color w:val="000000"/>
+                <w:sz w:val="28"/>
+                <w:szCs w:val="32"/>
+              </w:rPr>
+              <w:t>Krama Vaakyam No.-</w:t>
+            </w:r>
+            <w:r>
+              <w:rPr>
+                <w:rFonts w:cs="Arial"/>
+                <w:b/>
+                <w:color w:val="000000"/>
+                <w:sz w:val="28"/>
+                <w:szCs w:val="32"/>
+              </w:rPr>
+              <w:t xml:space="preserve"> 4</w:t>
+            </w:r>
+            <w:r>
+              <w:rPr>
+                <w:rFonts w:cs="Arial"/>
+                <w:b/>
+                <w:color w:val="000000"/>
+                <w:sz w:val="28"/>
+                <w:szCs w:val="32"/>
+              </w:rPr>
+              <w:t>2</w:t>
+            </w:r>
+          </w:p>
+          <w:p>
+            <w:pPr>
+              <w:widowControl w:val="0"/>
+              <w:tabs>
+                <w:tab w:val="left" w:pos="993"/>
+              </w:tabs>
+              <w:autoSpaceDE w:val="0"/>
+              <w:autoSpaceDN w:val="0"/>
+              <w:adjustRightInd w:val="0"/>
+              <w:spacing w:before="0" w:line="240" w:lineRule="auto"/>
+              <w:ind w:right="297"/>
+              <w:rPr>
+                <w:rFonts w:cs="Arial"/>
+                <w:b/>
+                <w:color w:val="000000"/>
+                <w:sz w:val="28"/>
+                <w:szCs w:val="32"/>
+              </w:rPr>
+            </w:pPr>
+            <w:r>
+              <w:rPr>
+                <w:rFonts w:cs="Arial"/>
+                <w:b/>
+                <w:color w:val="000000"/>
+                <w:sz w:val="28"/>
+                <w:szCs w:val="32"/>
+              </w:rPr>
+              <w:t>Panchaati No</w:t>
+            </w:r>
+            <w:r>
+              <w:rPr>
+                <w:rFonts w:cs="Arial"/>
+                <w:b/>
+                <w:color w:val="000000"/>
+                <w:szCs w:val="32"/>
+              </w:rPr>
+              <w:t>. -</w:t>
+            </w:r>
+            <w:r>
+              <w:rPr>
+                <w:rFonts w:cs="Arial"/>
+                <w:b/>
+                <w:color w:val="000000"/>
+                <w:szCs w:val="32"/>
+              </w:rPr>
+              <w:t xml:space="preserve"> </w:t>
+            </w:r>
+            <w:r>
+              <w:rPr>
+                <w:rFonts w:cs="Arial"/>
+                <w:b/>
+                <w:color w:val="000000"/>
+                <w:sz w:val="28"/>
+                <w:szCs w:val="28"/>
+              </w:rPr>
+              <w:t>2</w:t>
+            </w:r>
+            <w:r>
+              <w:rPr>
+                <w:rFonts w:cs="Arial"/>
+                <w:b/>
+                <w:color w:val="000000"/>
+                <w:sz w:val="28"/>
+                <w:szCs w:val="28"/>
+              </w:rPr>
+              <w:t>1</w:t>
+            </w:r>
+          </w:p>
+        </w:tc>
+        <w:tc>
+          <w:tcPr>
+            <w:tcW w:w="5386" w:type="dxa"/>
+          </w:tcPr>
+          <w:p>
+            <w:pPr>
+              <w:widowControl w:val="0"/>
+              <w:autoSpaceDE w:val="0"/>
+              <w:autoSpaceDN w:val="0"/>
+              <w:adjustRightInd w:val="0"/>
+              <w:spacing w:before="0" w:line="240" w:lineRule="auto"/>
+              <w:rPr>
+                <w:rFonts w:ascii="Latha" w:hAnsi="Latha" w:cs="Latha"/>
+                <w:sz w:val="28"/>
+                <w:szCs w:val="28"/>
+                <w:cs/>
+                <w:lang w:bidi="ta-IN"/>
+              </w:rPr>
+            </w:pPr>
+            <w:r>
+              <w:rPr>
+                <w:rFonts w:ascii="Latha" w:hAnsi="Latha" w:cs="Latha"/>
+                <w:sz w:val="28"/>
+                <w:szCs w:val="28"/>
+                <w:cs/>
+                <w:lang w:bidi="ta-IN"/>
+              </w:rPr>
+              <w:t>சி</w:t>
+            </w:r>
+            <w:r>
+              <w:rPr>
+                <w:rFonts w:ascii="BRH Tamil Tab Extra" w:hAnsi="BRH Tamil Tab Extra" w:cs="Latha"/>
+                <w:b/>
+                <w:sz w:val="32"/>
+                <w:szCs w:val="28"/>
+                <w:lang w:bidi="ta-IN"/>
+              </w:rPr>
+              <w:t>…</w:t>
+            </w:r>
+            <w:r>
+              <w:rPr>
+                <w:rFonts w:ascii="Latha" w:hAnsi="Latha" w:cs="Latha"/>
+                <w:b/>
+                <w:bCs/>
+                <w:position w:val="-12"/>
+                <w:sz w:val="28"/>
+                <w:szCs w:val="28"/>
+                <w:cs/>
+                <w:lang w:bidi="ta-IN"/>
+              </w:rPr>
+              <w:t>2</w:t>
+            </w:r>
+            <w:r>
+              <w:rPr>
+                <w:rFonts w:ascii="Latha" w:hAnsi="Latha" w:cs="Latha"/>
+                <w:sz w:val="28"/>
+                <w:szCs w:val="28"/>
+                <w:cs/>
+                <w:lang w:bidi="ta-IN"/>
+              </w:rPr>
+              <w:t>ன</w:t>
+            </w:r>
+            <w:r>
+              <w:rPr>
+                <w:rFonts w:ascii="BRH Tamil Tab Extra" w:hAnsi="BRH Tamil Tab Extra" w:cs="Latha"/>
+                <w:b/>
+                <w:sz w:val="32"/>
+                <w:szCs w:val="28"/>
+                <w:lang w:bidi="ta-IN"/>
+              </w:rPr>
+              <w:t>…</w:t>
+            </w:r>
+            <w:r>
+              <w:rPr>
+                <w:rFonts w:ascii="Latha" w:hAnsi="Latha" w:cs="Latha"/>
+                <w:sz w:val="28"/>
+                <w:szCs w:val="28"/>
+                <w:cs/>
+                <w:lang w:bidi="ta-IN"/>
+              </w:rPr>
+              <w:t>த்தி</w:t>
+            </w:r>
+            <w:r>
+              <w:rPr>
+                <w:rFonts w:ascii="BRH Tamil Tab Extra" w:hAnsi="BRH Tamil Tab Extra" w:cs="Latha"/>
+                <w:b/>
+                <w:sz w:val="32"/>
+                <w:szCs w:val="28"/>
+                <w:lang w:bidi="ta-IN"/>
+              </w:rPr>
+              <w:t>…</w:t>
+            </w:r>
+            <w:r>
+              <w:rPr>
+                <w:rFonts w:ascii="Latha" w:hAnsi="Latha" w:cs="Latha"/>
+                <w:sz w:val="28"/>
+                <w:szCs w:val="28"/>
+                <w:lang w:bidi="ta-IN"/>
+              </w:rPr>
+              <w:t xml:space="preserve"> </w:t>
+            </w:r>
+            <w:r>
+              <w:rPr>
+                <w:rFonts w:ascii="Latha" w:hAnsi="Latha" w:cs="Latha"/>
+                <w:sz w:val="28"/>
+                <w:szCs w:val="28"/>
+                <w:highlight w:val="yellow"/>
+                <w:cs/>
+                <w:lang w:bidi="ta-IN"/>
+              </w:rPr>
+              <w:t>பா</w:t>
+            </w:r>
+            <w:r>
+              <w:rPr>
+                <w:rFonts w:ascii="Latha" w:hAnsi="Latha" w:cs="Latha"/>
+                <w:b/>
+                <w:bCs/>
+                <w:position w:val="-12"/>
+                <w:sz w:val="28"/>
+                <w:szCs w:val="28"/>
+                <w:highlight w:val="yellow"/>
+                <w:cs/>
+                <w:lang w:bidi="ta-IN"/>
+              </w:rPr>
+              <w:t>4</w:t>
+            </w:r>
+            <w:r>
+              <w:rPr>
+                <w:rFonts w:ascii="Latha" w:hAnsi="Latha" w:cs="Latha"/>
+                <w:sz w:val="28"/>
+                <w:szCs w:val="28"/>
+                <w:highlight w:val="yellow"/>
+                <w:cs/>
+                <w:lang w:bidi="ta-IN"/>
+              </w:rPr>
+              <w:t>த்</w:t>
+            </w:r>
+            <w:r>
+              <w:rPr>
+                <w:rFonts w:ascii="Latha" w:hAnsi="Latha" w:cs="Latha"/>
+                <w:b/>
+                <w:bCs/>
+                <w:i/>
+                <w:iCs/>
+                <w:sz w:val="28"/>
+                <w:szCs w:val="28"/>
+                <w:highlight w:val="yellow"/>
+                <w:cs/>
+                <w:lang w:bidi="ta-IN"/>
+              </w:rPr>
+              <w:t>ரு</w:t>
+            </w:r>
+            <w:r>
+              <w:rPr>
+                <w:rFonts w:ascii="BRH Tamil Tab Extra" w:hAnsi="BRH Tamil Tab Extra" w:cs="Latha"/>
+                <w:b/>
+                <w:sz w:val="36"/>
+                <w:szCs w:val="28"/>
+                <w:highlight w:val="yellow"/>
+                <w:lang w:bidi="ta-IN"/>
+              </w:rPr>
+              <w:t>†</w:t>
+            </w:r>
+            <w:r>
+              <w:rPr>
+                <w:rFonts w:ascii="Latha" w:hAnsi="Latha" w:cs="Latha"/>
+                <w:sz w:val="28"/>
+                <w:szCs w:val="28"/>
+                <w:cs/>
+                <w:lang w:bidi="ta-IN"/>
+              </w:rPr>
+              <w:t xml:space="preserve">வ்யஸ்ய </w:t>
+            </w:r>
+            <w:r>
+              <w:rPr>
+                <w:rFonts w:ascii="Latha" w:hAnsi="Latha" w:cs="Latha"/>
+                <w:sz w:val="28"/>
+                <w:szCs w:val="28"/>
+                <w:lang w:bidi="ta-IN"/>
+              </w:rPr>
+              <w:t xml:space="preserve">| </w:t>
+            </w:r>
+            <w:r>
+              <w:rPr>
+                <w:rFonts w:ascii="Latha" w:hAnsi="Latha" w:cs="Latha"/>
+                <w:sz w:val="28"/>
+                <w:szCs w:val="28"/>
+                <w:cs/>
+                <w:lang w:bidi="ta-IN"/>
+              </w:rPr>
+              <w:t>ப்</w:t>
+            </w:r>
+            <w:r>
+              <w:rPr>
+                <w:rFonts w:ascii="Latha" w:hAnsi="Latha" w:cs="Latha"/>
+                <w:b/>
+                <w:bCs/>
+                <w:position w:val="-12"/>
+                <w:sz w:val="28"/>
+                <w:szCs w:val="28"/>
+                <w:cs/>
+                <w:lang w:bidi="ta-IN"/>
+              </w:rPr>
+              <w:t>4</w:t>
+            </w:r>
+            <w:r>
+              <w:rPr>
+                <w:rFonts w:ascii="Latha" w:hAnsi="Latha" w:cs="Latha"/>
+                <w:sz w:val="28"/>
+                <w:szCs w:val="28"/>
+                <w:cs/>
+                <w:lang w:bidi="ta-IN"/>
+              </w:rPr>
+              <w:t>ராத்</w:t>
+            </w:r>
+            <w:r>
+              <w:rPr>
+                <w:rFonts w:ascii="Latha" w:hAnsi="Latha" w:cs="Latha"/>
+                <w:b/>
+                <w:bCs/>
+                <w:i/>
+                <w:iCs/>
+                <w:sz w:val="28"/>
+                <w:szCs w:val="28"/>
+                <w:cs/>
+                <w:lang w:bidi="ta-IN"/>
+              </w:rPr>
+              <w:t>ரு</w:t>
+            </w:r>
+            <w:r>
+              <w:rPr>
+                <w:rFonts w:ascii="BRH Tamil Tab Extra" w:hAnsi="BRH Tamil Tab Extra" w:cs="Latha"/>
+                <w:b/>
+                <w:sz w:val="36"/>
+                <w:szCs w:val="28"/>
+                <w:lang w:bidi="ta-IN"/>
+              </w:rPr>
+              <w:t>†</w:t>
+            </w:r>
+            <w:r>
+              <w:rPr>
+                <w:rFonts w:ascii="Latha" w:hAnsi="Latha" w:cs="Latha"/>
+                <w:sz w:val="28"/>
+                <w:szCs w:val="28"/>
+                <w:cs/>
+                <w:lang w:bidi="ta-IN"/>
+              </w:rPr>
+              <w:t>வ்யஸ்யை</w:t>
+            </w:r>
+            <w:r>
+              <w:rPr>
+                <w:rFonts w:ascii="BRH Tamil Tab Extra" w:hAnsi="BRH Tamil Tab Extra" w:cs="Latha"/>
+                <w:b/>
+                <w:sz w:val="32"/>
+                <w:szCs w:val="28"/>
+                <w:lang w:bidi="ta-IN"/>
+              </w:rPr>
+              <w:t>…</w:t>
+            </w:r>
+            <w:r>
+              <w:rPr>
+                <w:rFonts w:ascii="Latha" w:hAnsi="Latha" w:cs="Latha"/>
+                <w:sz w:val="28"/>
+                <w:szCs w:val="28"/>
+                <w:cs/>
+                <w:lang w:bidi="ta-IN"/>
+              </w:rPr>
+              <w:t xml:space="preserve">வ </w:t>
+            </w:r>
+            <w:r>
+              <w:rPr>
+                <w:rFonts w:ascii="Latha" w:hAnsi="Latha" w:cs="Latha"/>
+                <w:sz w:val="28"/>
+                <w:szCs w:val="28"/>
+                <w:lang w:bidi="ta-IN"/>
+              </w:rPr>
+              <w:t>|</w:t>
+            </w:r>
+          </w:p>
+        </w:tc>
+        <w:tc>
+          <w:tcPr>
+            <w:tcW w:w="5220" w:type="dxa"/>
+          </w:tcPr>
+          <w:p>
+            <w:pPr>
+              <w:widowControl w:val="0"/>
+              <w:autoSpaceDE w:val="0"/>
+              <w:autoSpaceDN w:val="0"/>
+              <w:adjustRightInd w:val="0"/>
+              <w:spacing w:before="0" w:line="240" w:lineRule="auto"/>
+              <w:rPr>
+                <w:rFonts w:ascii="Latha" w:hAnsi="Latha" w:cs="Latha"/>
+                <w:sz w:val="28"/>
+                <w:szCs w:val="28"/>
+                <w:cs/>
+                <w:lang w:bidi="ta-IN"/>
+              </w:rPr>
+            </w:pPr>
+            <w:r>
+              <w:rPr>
+                <w:rFonts w:ascii="Latha" w:hAnsi="Latha" w:cs="Latha"/>
+                <w:sz w:val="28"/>
+                <w:szCs w:val="28"/>
+                <w:cs/>
+                <w:lang w:bidi="ta-IN"/>
+              </w:rPr>
+              <w:t>சி</w:t>
+            </w:r>
+            <w:r>
+              <w:rPr>
+                <w:rFonts w:ascii="BRH Tamil Tab Extra" w:hAnsi="BRH Tamil Tab Extra" w:cs="Latha"/>
+                <w:b/>
+                <w:sz w:val="32"/>
+                <w:szCs w:val="28"/>
+                <w:lang w:bidi="ta-IN"/>
+              </w:rPr>
+              <w:t>…</w:t>
+            </w:r>
+            <w:r>
+              <w:rPr>
+                <w:rFonts w:ascii="Latha" w:hAnsi="Latha" w:cs="Latha"/>
+                <w:b/>
+                <w:bCs/>
+                <w:position w:val="-12"/>
+                <w:sz w:val="28"/>
+                <w:szCs w:val="28"/>
+                <w:cs/>
+                <w:lang w:bidi="ta-IN"/>
+              </w:rPr>
+              <w:t>2</w:t>
+            </w:r>
+            <w:r>
+              <w:rPr>
+                <w:rFonts w:ascii="Latha" w:hAnsi="Latha" w:cs="Latha"/>
+                <w:sz w:val="28"/>
+                <w:szCs w:val="28"/>
+                <w:cs/>
+                <w:lang w:bidi="ta-IN"/>
+              </w:rPr>
+              <w:t>ன</w:t>
+            </w:r>
+            <w:r>
+              <w:rPr>
+                <w:rFonts w:ascii="BRH Tamil Tab Extra" w:hAnsi="BRH Tamil Tab Extra" w:cs="Latha"/>
+                <w:b/>
+                <w:sz w:val="32"/>
+                <w:szCs w:val="28"/>
+                <w:lang w:bidi="ta-IN"/>
+              </w:rPr>
+              <w:t>…</w:t>
+            </w:r>
+            <w:r>
+              <w:rPr>
+                <w:rFonts w:ascii="Latha" w:hAnsi="Latha" w:cs="Latha"/>
+                <w:sz w:val="28"/>
+                <w:szCs w:val="28"/>
+                <w:cs/>
+                <w:lang w:bidi="ta-IN"/>
+              </w:rPr>
+              <w:t>த்தி</w:t>
+            </w:r>
+            <w:r>
+              <w:rPr>
+                <w:rFonts w:ascii="BRH Tamil Tab Extra" w:hAnsi="BRH Tamil Tab Extra" w:cs="Latha"/>
+                <w:b/>
+                <w:sz w:val="32"/>
+                <w:szCs w:val="28"/>
+                <w:lang w:bidi="ta-IN"/>
+              </w:rPr>
+              <w:t>…</w:t>
+            </w:r>
+            <w:r>
+              <w:rPr>
+                <w:rFonts w:ascii="Latha" w:hAnsi="Latha" w:cs="Latha"/>
+                <w:sz w:val="28"/>
+                <w:szCs w:val="28"/>
+                <w:lang w:bidi="ta-IN"/>
+              </w:rPr>
+              <w:t xml:space="preserve"> </w:t>
+            </w:r>
+            <w:r>
+              <w:rPr>
+                <w:rFonts w:ascii="Latha" w:hAnsi="Latha" w:cs="Latha"/>
+                <w:sz w:val="28"/>
+                <w:szCs w:val="28"/>
+                <w:highlight w:val="green"/>
+                <w:cs/>
+                <w:lang w:bidi="ta-IN"/>
+              </w:rPr>
+              <w:t>ப்</w:t>
+            </w:r>
+            <w:r>
+              <w:rPr>
+                <w:rFonts w:ascii="Latha" w:hAnsi="Latha" w:cs="Latha"/>
+                <w:b/>
+                <w:bCs/>
+                <w:position w:val="-12"/>
+                <w:sz w:val="28"/>
+                <w:szCs w:val="28"/>
+                <w:highlight w:val="green"/>
+                <w:cs/>
+                <w:lang w:bidi="ta-IN"/>
+              </w:rPr>
+              <w:t>4</w:t>
+            </w:r>
+            <w:r>
+              <w:rPr>
+                <w:rFonts w:ascii="Latha" w:hAnsi="Latha" w:cs="Latha"/>
+                <w:sz w:val="28"/>
+                <w:szCs w:val="28"/>
+                <w:highlight w:val="green"/>
+                <w:cs/>
+                <w:lang w:bidi="ta-IN"/>
+              </w:rPr>
+              <w:t>ராத்</w:t>
+            </w:r>
+            <w:r>
+              <w:rPr>
+                <w:rFonts w:ascii="Latha" w:hAnsi="Latha" w:cs="Latha"/>
+                <w:b/>
+                <w:bCs/>
+                <w:i/>
+                <w:iCs/>
+                <w:sz w:val="28"/>
+                <w:szCs w:val="28"/>
+                <w:highlight w:val="green"/>
+                <w:cs/>
+                <w:lang w:bidi="ta-IN"/>
+              </w:rPr>
+              <w:t>ரு</w:t>
+            </w:r>
+            <w:r>
+              <w:rPr>
+                <w:rFonts w:ascii="BRH Tamil Tab Extra" w:hAnsi="BRH Tamil Tab Extra" w:cs="Latha"/>
+                <w:b/>
+                <w:sz w:val="36"/>
+                <w:szCs w:val="28"/>
+                <w:highlight w:val="green"/>
+                <w:lang w:bidi="ta-IN"/>
+              </w:rPr>
+              <w:t>†</w:t>
+            </w:r>
+            <w:r>
+              <w:rPr>
+                <w:rFonts w:ascii="Latha" w:hAnsi="Latha" w:cs="Latha"/>
+                <w:sz w:val="28"/>
+                <w:szCs w:val="28"/>
+                <w:cs/>
+                <w:lang w:bidi="ta-IN"/>
+              </w:rPr>
+              <w:t xml:space="preserve">வ்யஸ்ய </w:t>
+            </w:r>
+            <w:r>
+              <w:rPr>
+                <w:rFonts w:ascii="Latha" w:hAnsi="Latha" w:cs="Latha"/>
+                <w:sz w:val="28"/>
+                <w:szCs w:val="28"/>
+                <w:lang w:bidi="ta-IN"/>
+              </w:rPr>
+              <w:t xml:space="preserve">| </w:t>
+            </w:r>
+            <w:r>
+              <w:rPr>
+                <w:rFonts w:ascii="Latha" w:hAnsi="Latha" w:cs="Latha"/>
+                <w:sz w:val="28"/>
+                <w:szCs w:val="28"/>
+                <w:cs/>
+                <w:lang w:bidi="ta-IN"/>
+              </w:rPr>
+              <w:t>ப்</w:t>
+            </w:r>
+            <w:r>
+              <w:rPr>
+                <w:rFonts w:ascii="Latha" w:hAnsi="Latha" w:cs="Latha"/>
+                <w:b/>
+                <w:bCs/>
+                <w:position w:val="-12"/>
+                <w:sz w:val="28"/>
+                <w:szCs w:val="28"/>
+                <w:cs/>
+                <w:lang w:bidi="ta-IN"/>
+              </w:rPr>
+              <w:t>4</w:t>
+            </w:r>
+            <w:r>
+              <w:rPr>
+                <w:rFonts w:ascii="Latha" w:hAnsi="Latha" w:cs="Latha"/>
+                <w:sz w:val="28"/>
+                <w:szCs w:val="28"/>
+                <w:cs/>
+                <w:lang w:bidi="ta-IN"/>
+              </w:rPr>
+              <w:t>ராத்</w:t>
+            </w:r>
+            <w:r>
+              <w:rPr>
+                <w:rFonts w:ascii="Latha" w:hAnsi="Latha" w:cs="Latha"/>
+                <w:b/>
+                <w:bCs/>
+                <w:i/>
+                <w:iCs/>
+                <w:sz w:val="28"/>
+                <w:szCs w:val="28"/>
+                <w:cs/>
+                <w:lang w:bidi="ta-IN"/>
+              </w:rPr>
+              <w:t>ரு</w:t>
+            </w:r>
+            <w:r>
+              <w:rPr>
+                <w:rFonts w:ascii="BRH Tamil Tab Extra" w:hAnsi="BRH Tamil Tab Extra" w:cs="Latha"/>
+                <w:b/>
+                <w:sz w:val="36"/>
+                <w:szCs w:val="28"/>
+                <w:lang w:bidi="ta-IN"/>
+              </w:rPr>
+              <w:t>†</w:t>
+            </w:r>
+            <w:r>
+              <w:rPr>
+                <w:rFonts w:ascii="Latha" w:hAnsi="Latha" w:cs="Latha"/>
+                <w:sz w:val="28"/>
+                <w:szCs w:val="28"/>
+                <w:cs/>
+                <w:lang w:bidi="ta-IN"/>
+              </w:rPr>
+              <w:t>வ்யஸ்யை</w:t>
+            </w:r>
+            <w:r>
+              <w:rPr>
+                <w:rFonts w:ascii="BRH Tamil Tab Extra" w:hAnsi="BRH Tamil Tab Extra" w:cs="Latha"/>
+                <w:b/>
+                <w:sz w:val="32"/>
+                <w:szCs w:val="28"/>
+                <w:lang w:bidi="ta-IN"/>
+              </w:rPr>
+              <w:t>…</w:t>
+            </w:r>
+            <w:r>
+              <w:rPr>
+                <w:rFonts w:ascii="Latha" w:hAnsi="Latha" w:cs="Latha"/>
+                <w:sz w:val="28"/>
+                <w:szCs w:val="28"/>
+                <w:cs/>
+                <w:lang w:bidi="ta-IN"/>
+              </w:rPr>
+              <w:t xml:space="preserve">வ </w:t>
+            </w:r>
+            <w:r>
+              <w:rPr>
+                <w:rFonts w:ascii="Latha" w:hAnsi="Latha" w:cs="Latha"/>
+                <w:sz w:val="28"/>
+                <w:szCs w:val="28"/>
+                <w:lang w:bidi="ta-IN"/>
+              </w:rPr>
+              <w:t>|</w:t>
+            </w:r>
+          </w:p>
+        </w:tc>
+      </w:tr>
+      <w:tr>
+        <w:trPr>
+          <w:trHeight w:val="1091"/>
+        </w:trPr>
+        <w:tc>
+          <w:tcPr>
+            <w:tcW w:w="4048" w:type="dxa"/>
+          </w:tcPr>
+          <w:p>
+            <w:pPr>
+              <w:widowControl w:val="0"/>
+              <w:tabs>
+                <w:tab w:val="left" w:pos="993"/>
+              </w:tabs>
+              <w:autoSpaceDE w:val="0"/>
+              <w:autoSpaceDN w:val="0"/>
+              <w:adjustRightInd w:val="0"/>
+              <w:spacing w:before="0" w:line="240" w:lineRule="auto"/>
+              <w:ind w:right="297"/>
+              <w:rPr>
+                <w:rFonts w:cs="Arial"/>
+                <w:b/>
+                <w:color w:val="000000"/>
+                <w:sz w:val="28"/>
+                <w:szCs w:val="32"/>
+              </w:rPr>
+            </w:pPr>
+            <w:r>
+              <w:rPr>
+                <w:rFonts w:cs="Arial"/>
+                <w:b/>
+                <w:color w:val="000000"/>
+                <w:sz w:val="28"/>
+                <w:szCs w:val="32"/>
+              </w:rPr>
+              <w:t>T.S.2.</w:t>
+            </w:r>
+            <w:r>
+              <w:rPr>
+                <w:rFonts w:cs="Arial"/>
+                <w:b/>
+                <w:color w:val="000000"/>
+                <w:sz w:val="28"/>
+                <w:szCs w:val="32"/>
+              </w:rPr>
+              <w:t>6.</w:t>
+            </w:r>
+            <w:r>
+              <w:rPr>
+                <w:rFonts w:cs="Arial"/>
+                <w:b/>
+                <w:color w:val="000000"/>
+                <w:sz w:val="28"/>
+                <w:szCs w:val="32"/>
+              </w:rPr>
+              <w:t>9.1</w:t>
+            </w:r>
+            <w:r>
+              <w:rPr>
+                <w:rFonts w:cs="Arial"/>
+                <w:b/>
+                <w:color w:val="000000"/>
+                <w:sz w:val="28"/>
+                <w:szCs w:val="32"/>
+              </w:rPr>
+              <w:t xml:space="preserve"> </w:t>
+            </w:r>
+            <w:r>
+              <w:rPr>
+                <w:rFonts w:cs="Arial"/>
+                <w:b/>
+                <w:color w:val="000000"/>
+                <w:sz w:val="28"/>
+                <w:szCs w:val="32"/>
+              </w:rPr>
+              <w:t>– Kramam</w:t>
+            </w:r>
+          </w:p>
+          <w:p>
+            <w:pPr>
+              <w:widowControl w:val="0"/>
+              <w:tabs>
+                <w:tab w:val="left" w:pos="993"/>
+              </w:tabs>
+              <w:autoSpaceDE w:val="0"/>
+              <w:autoSpaceDN w:val="0"/>
+              <w:adjustRightInd w:val="0"/>
+              <w:spacing w:before="0" w:line="240" w:lineRule="auto"/>
+              <w:ind w:right="297"/>
+              <w:rPr>
+                <w:rFonts w:cs="Arial"/>
+                <w:b/>
+                <w:color w:val="000000"/>
+                <w:sz w:val="28"/>
+                <w:szCs w:val="32"/>
+              </w:rPr>
+            </w:pPr>
+            <w:r>
+              <w:rPr>
+                <w:rFonts w:cs="Arial"/>
+                <w:b/>
+                <w:color w:val="000000"/>
+                <w:sz w:val="28"/>
+                <w:szCs w:val="32"/>
+              </w:rPr>
+              <w:t>Krama Vaakyam No.-</w:t>
+            </w:r>
+            <w:r>
+              <w:rPr>
+                <w:rFonts w:cs="Arial"/>
+                <w:b/>
+                <w:color w:val="000000"/>
+                <w:sz w:val="28"/>
+                <w:szCs w:val="32"/>
+              </w:rPr>
+              <w:t xml:space="preserve"> </w:t>
+            </w:r>
+            <w:r>
+              <w:rPr>
+                <w:rFonts w:cs="Arial"/>
+                <w:b/>
+                <w:color w:val="000000"/>
+                <w:sz w:val="28"/>
+                <w:szCs w:val="32"/>
+              </w:rPr>
+              <w:t>37</w:t>
+            </w:r>
+          </w:p>
+          <w:p>
+            <w:pPr>
+              <w:widowControl w:val="0"/>
+              <w:tabs>
+                <w:tab w:val="left" w:pos="993"/>
+              </w:tabs>
+              <w:autoSpaceDE w:val="0"/>
+              <w:autoSpaceDN w:val="0"/>
+              <w:adjustRightInd w:val="0"/>
+              <w:spacing w:before="0" w:line="240" w:lineRule="auto"/>
+              <w:ind w:right="297"/>
+              <w:rPr>
+                <w:rFonts w:cs="Arial"/>
+                <w:b/>
+                <w:color w:val="000000"/>
+                <w:sz w:val="28"/>
+                <w:szCs w:val="32"/>
+              </w:rPr>
+            </w:pPr>
+            <w:r>
+              <w:rPr>
+                <w:rFonts w:cs="Arial"/>
+                <w:b/>
+                <w:color w:val="000000"/>
+                <w:sz w:val="28"/>
+                <w:szCs w:val="32"/>
+              </w:rPr>
+              <w:t>Panchaati No</w:t>
+            </w:r>
+            <w:r>
+              <w:rPr>
+                <w:rFonts w:cs="Arial"/>
+                <w:b/>
+                <w:color w:val="000000"/>
+                <w:szCs w:val="32"/>
+              </w:rPr>
+              <w:t>. -</w:t>
+            </w:r>
+            <w:r>
+              <w:rPr>
+                <w:rFonts w:cs="Arial"/>
+                <w:b/>
+                <w:color w:val="000000"/>
+                <w:szCs w:val="32"/>
+              </w:rPr>
+              <w:t xml:space="preserve"> </w:t>
+            </w:r>
+            <w:r>
+              <w:rPr>
+                <w:rFonts w:cs="Arial"/>
+                <w:b/>
+                <w:color w:val="000000"/>
+                <w:sz w:val="28"/>
+                <w:szCs w:val="28"/>
+              </w:rPr>
+              <w:t>49</w:t>
+            </w:r>
+          </w:p>
+        </w:tc>
+        <w:tc>
+          <w:tcPr>
+            <w:tcW w:w="5386" w:type="dxa"/>
+          </w:tcPr>
+          <w:p>
+            <w:pPr>
+              <w:widowControl w:val="0"/>
+              <w:autoSpaceDE w:val="0"/>
+              <w:autoSpaceDN w:val="0"/>
+              <w:adjustRightInd w:val="0"/>
+              <w:spacing w:before="0" w:line="240" w:lineRule="auto"/>
+              <w:rPr>
+                <w:rFonts w:ascii="Latha" w:hAnsi="Latha" w:cs="Latha"/>
+                <w:sz w:val="28"/>
+                <w:szCs w:val="28"/>
+                <w:lang w:bidi="ta-IN"/>
+              </w:rPr>
+            </w:pPr>
+            <w:r>
+              <w:rPr>
+                <w:rFonts w:ascii="Latha" w:hAnsi="Latha" w:cs="Latha"/>
+                <w:sz w:val="28"/>
+                <w:szCs w:val="28"/>
+                <w:cs/>
+                <w:lang w:bidi="ta-IN"/>
+              </w:rPr>
+              <w:t>மா</w:t>
+            </w:r>
+            <w:r>
+              <w:rPr>
+                <w:rFonts w:ascii="BRH Tamil Tab Extra" w:hAnsi="BRH Tamil Tab Extra" w:cs="Latha"/>
+                <w:b/>
+                <w:sz w:val="32"/>
+                <w:szCs w:val="28"/>
+                <w:lang w:bidi="ta-IN"/>
+              </w:rPr>
+              <w:t>…</w:t>
+            </w:r>
+            <w:r>
+              <w:rPr>
+                <w:rFonts w:ascii="Latha" w:hAnsi="Latha" w:cs="Latha"/>
+                <w:sz w:val="28"/>
+                <w:szCs w:val="28"/>
+                <w:cs/>
+                <w:lang w:bidi="ta-IN"/>
+              </w:rPr>
+              <w:t>ர்ஷ்டி</w:t>
+            </w:r>
+            <w:r>
+              <w:rPr>
+                <w:rFonts w:ascii="BRH Tamil Tab Extra" w:hAnsi="BRH Tamil Tab Extra" w:cs="Latha"/>
+                <w:b/>
+                <w:sz w:val="32"/>
+                <w:szCs w:val="28"/>
+                <w:lang w:bidi="ta-IN"/>
+              </w:rPr>
+              <w:t>…</w:t>
+            </w:r>
+            <w:r>
+              <w:rPr>
+                <w:rFonts w:ascii="Latha" w:hAnsi="Latha" w:cs="Latha"/>
+                <w:sz w:val="28"/>
+                <w:szCs w:val="28"/>
+                <w:lang w:bidi="ta-IN"/>
+              </w:rPr>
+              <w:t xml:space="preserve"> </w:t>
+            </w:r>
+            <w:r>
+              <w:rPr>
+                <w:rFonts w:ascii="Latha" w:hAnsi="Latha" w:cs="Latha"/>
+                <w:sz w:val="28"/>
+                <w:szCs w:val="28"/>
+                <w:cs/>
+                <w:lang w:bidi="ta-IN"/>
+              </w:rPr>
+              <w:t>பராங்</w:t>
+            </w:r>
+            <w:r>
+              <w:rPr>
+                <w:rFonts w:ascii="BRH Tamil Tab Extra" w:hAnsi="BRH Tamil Tab Extra" w:cs="Latha"/>
+                <w:b/>
+                <w:sz w:val="36"/>
+                <w:szCs w:val="28"/>
+                <w:lang w:bidi="ta-IN"/>
+              </w:rPr>
+              <w:t>†</w:t>
+            </w:r>
+            <w:r>
+              <w:rPr>
+                <w:rFonts w:ascii="Latha" w:hAnsi="Latha" w:cs="Latha"/>
+                <w:sz w:val="28"/>
+                <w:szCs w:val="28"/>
+                <w:lang w:bidi="ta-IN"/>
+              </w:rPr>
+              <w:t xml:space="preserve"> | </w:t>
+            </w:r>
+            <w:r>
+              <w:rPr>
+                <w:rFonts w:ascii="Latha" w:hAnsi="Latha" w:cs="Latha"/>
+                <w:sz w:val="28"/>
+                <w:szCs w:val="28"/>
+                <w:cs/>
+                <w:lang w:bidi="ta-IN"/>
+              </w:rPr>
+              <w:t>பரா</w:t>
+            </w:r>
+            <w:r>
+              <w:rPr>
+                <w:rFonts w:ascii="BRH Tamil Tab Extra" w:hAnsi="BRH Tamil Tab Extra" w:cs="Latha"/>
+                <w:b/>
+                <w:sz w:val="36"/>
+                <w:szCs w:val="28"/>
+                <w:highlight w:val="yellow"/>
+                <w:lang w:bidi="ta-IN"/>
+              </w:rPr>
+              <w:t>†</w:t>
+            </w:r>
+            <w:r>
+              <w:rPr>
+                <w:rFonts w:ascii="Latha" w:hAnsi="Latha" w:cs="Latha"/>
+                <w:sz w:val="28"/>
+                <w:szCs w:val="28"/>
+                <w:highlight w:val="yellow"/>
+                <w:cs/>
+                <w:lang w:bidi="ta-IN"/>
+              </w:rPr>
+              <w:t>ங்ஙி</w:t>
+            </w:r>
+            <w:r>
+              <w:rPr>
+                <w:rFonts w:ascii="Latha" w:hAnsi="Latha" w:cs="Latha"/>
+                <w:sz w:val="28"/>
+                <w:szCs w:val="28"/>
+                <w:cs/>
+                <w:lang w:bidi="ta-IN"/>
+              </w:rPr>
+              <w:t xml:space="preserve">வ </w:t>
+            </w:r>
+            <w:r>
+              <w:rPr>
+                <w:rFonts w:ascii="Latha" w:hAnsi="Latha" w:cs="Latha"/>
+                <w:sz w:val="28"/>
+                <w:szCs w:val="28"/>
+                <w:lang w:bidi="ta-IN"/>
+              </w:rPr>
+              <w:t>|</w:t>
+            </w:r>
+          </w:p>
+          <w:p>
+            <w:pPr>
+              <w:widowControl w:val="0"/>
+              <w:autoSpaceDE w:val="0"/>
+              <w:autoSpaceDN w:val="0"/>
+              <w:adjustRightInd w:val="0"/>
+              <w:spacing w:before="0" w:line="240" w:lineRule="auto"/>
+              <w:rPr>
+                <w:rFonts w:ascii="Latha" w:hAnsi="Latha" w:cs="Latha"/>
+                <w:sz w:val="28"/>
+                <w:szCs w:val="28"/>
+                <w:cs/>
+                <w:lang w:bidi="ta-IN"/>
+              </w:rPr>
+            </w:pPr>
+            <w:r>
+              <w:rPr>
+                <w:rFonts w:ascii="Latha" w:hAnsi="Latha" w:cs="Latha"/>
+                <w:sz w:val="28"/>
+                <w:szCs w:val="28"/>
+                <w:lang w:bidi="ta-IN"/>
+              </w:rPr>
+              <w:t>No doubling after long vowel</w:t>
+            </w:r>
+          </w:p>
+        </w:tc>
+        <w:tc>
+          <w:tcPr>
+            <w:tcW w:w="5220" w:type="dxa"/>
+          </w:tcPr>
+          <w:p>
+            <w:pPr>
+              <w:widowControl w:val="0"/>
+              <w:autoSpaceDE w:val="0"/>
+              <w:autoSpaceDN w:val="0"/>
+              <w:adjustRightInd w:val="0"/>
+              <w:spacing w:before="0" w:line="240" w:lineRule="auto"/>
+              <w:rPr>
+                <w:rFonts w:ascii="Latha" w:hAnsi="Latha" w:cs="Latha"/>
+                <w:sz w:val="28"/>
+                <w:szCs w:val="28"/>
+                <w:cs/>
+                <w:lang w:bidi="ta-IN"/>
+              </w:rPr>
+            </w:pPr>
+            <w:r>
+              <w:rPr>
+                <w:rFonts w:ascii="Latha" w:hAnsi="Latha" w:cs="Latha"/>
+                <w:sz w:val="28"/>
+                <w:szCs w:val="28"/>
+                <w:cs/>
+                <w:lang w:bidi="ta-IN"/>
+              </w:rPr>
+              <w:t>மா</w:t>
+            </w:r>
+            <w:r>
+              <w:rPr>
+                <w:rFonts w:ascii="BRH Tamil Tab Extra" w:hAnsi="BRH Tamil Tab Extra" w:cs="Latha"/>
+                <w:b/>
+                <w:sz w:val="32"/>
+                <w:szCs w:val="28"/>
+                <w:lang w:bidi="ta-IN"/>
+              </w:rPr>
+              <w:t>…</w:t>
+            </w:r>
+            <w:r>
+              <w:rPr>
+                <w:rFonts w:ascii="Latha" w:hAnsi="Latha" w:cs="Latha"/>
+                <w:sz w:val="28"/>
+                <w:szCs w:val="28"/>
+                <w:cs/>
+                <w:lang w:bidi="ta-IN"/>
+              </w:rPr>
+              <w:t>ர்ஷ்டி</w:t>
+            </w:r>
+            <w:r>
+              <w:rPr>
+                <w:rFonts w:ascii="BRH Tamil Tab Extra" w:hAnsi="BRH Tamil Tab Extra" w:cs="Latha"/>
+                <w:b/>
+                <w:sz w:val="32"/>
+                <w:szCs w:val="28"/>
+                <w:lang w:bidi="ta-IN"/>
+              </w:rPr>
+              <w:t>…</w:t>
+            </w:r>
+            <w:r>
+              <w:rPr>
+                <w:rFonts w:ascii="Latha" w:hAnsi="Latha" w:cs="Latha"/>
+                <w:sz w:val="28"/>
+                <w:szCs w:val="28"/>
+                <w:lang w:bidi="ta-IN"/>
+              </w:rPr>
+              <w:t xml:space="preserve"> </w:t>
+            </w:r>
+            <w:r>
+              <w:rPr>
+                <w:rFonts w:ascii="Latha" w:hAnsi="Latha" w:cs="Latha"/>
+                <w:sz w:val="28"/>
+                <w:szCs w:val="28"/>
+                <w:cs/>
+                <w:lang w:bidi="ta-IN"/>
+              </w:rPr>
+              <w:t>பராங்</w:t>
+            </w:r>
+            <w:r>
+              <w:rPr>
+                <w:rFonts w:ascii="BRH Tamil Tab Extra" w:hAnsi="BRH Tamil Tab Extra" w:cs="Latha"/>
+                <w:b/>
+                <w:sz w:val="36"/>
+                <w:szCs w:val="28"/>
+                <w:lang w:bidi="ta-IN"/>
+              </w:rPr>
+              <w:t>†</w:t>
+            </w:r>
+            <w:r>
+              <w:rPr>
+                <w:rFonts w:ascii="Latha" w:hAnsi="Latha" w:cs="Latha"/>
+                <w:sz w:val="28"/>
+                <w:szCs w:val="28"/>
+                <w:lang w:bidi="ta-IN"/>
+              </w:rPr>
+              <w:t xml:space="preserve"> | </w:t>
+            </w:r>
+            <w:r>
+              <w:rPr>
+                <w:rFonts w:ascii="Latha" w:hAnsi="Latha" w:cs="Latha"/>
+                <w:sz w:val="28"/>
+                <w:szCs w:val="28"/>
+                <w:cs/>
+                <w:lang w:bidi="ta-IN"/>
+              </w:rPr>
+              <w:t>பரா</w:t>
+            </w:r>
+            <w:r>
+              <w:rPr>
+                <w:rFonts w:ascii="BRH Tamil Tab Extra" w:hAnsi="BRH Tamil Tab Extra" w:cs="Latha"/>
+                <w:b/>
+                <w:sz w:val="36"/>
+                <w:szCs w:val="28"/>
+                <w:highlight w:val="yellow"/>
+                <w:lang w:bidi="ta-IN"/>
+              </w:rPr>
+              <w:t>†</w:t>
+            </w:r>
+            <w:r>
+              <w:rPr>
+                <w:rFonts w:ascii="Latha" w:hAnsi="Latha" w:cs="Latha"/>
+                <w:sz w:val="28"/>
+                <w:szCs w:val="28"/>
+                <w:highlight w:val="green"/>
+                <w:cs/>
+                <w:lang w:bidi="ta-IN"/>
+              </w:rPr>
+              <w:t>ஙிவ</w:t>
+            </w:r>
+            <w:r>
+              <w:rPr>
+                <w:rFonts w:ascii="Latha" w:hAnsi="Latha" w:cs="Latha"/>
+                <w:sz w:val="28"/>
+                <w:szCs w:val="28"/>
+                <w:cs/>
+                <w:lang w:bidi="ta-IN"/>
+              </w:rPr>
+              <w:t xml:space="preserve"> </w:t>
+            </w:r>
+            <w:r>
+              <w:rPr>
+                <w:rFonts w:ascii="Latha" w:hAnsi="Latha" w:cs="Latha"/>
+                <w:sz w:val="28"/>
+                <w:szCs w:val="28"/>
+                <w:lang w:bidi="ta-IN"/>
+              </w:rPr>
+              <w:t>|</w:t>
+            </w:r>
+          </w:p>
+        </w:tc>
+      </w:tr>
+      <w:tr>
+        <w:trPr>
+          <w:trHeight w:val="1091"/>
+        </w:trPr>
+        <w:tc>
+          <w:tcPr>
+            <w:tcW w:w="4048" w:type="dxa"/>
+          </w:tcPr>
+          <w:p>
+            <w:pPr>
+              <w:widowControl w:val="0"/>
+              <w:tabs>
+                <w:tab w:val="left" w:pos="993"/>
+              </w:tabs>
+              <w:autoSpaceDE w:val="0"/>
+              <w:autoSpaceDN w:val="0"/>
+              <w:adjustRightInd w:val="0"/>
+              <w:spacing w:before="0" w:line="240" w:lineRule="auto"/>
+              <w:ind w:right="297"/>
+              <w:rPr>
+                <w:rFonts w:cs="Arial"/>
+                <w:b/>
+                <w:color w:val="000000"/>
+                <w:sz w:val="28"/>
+                <w:szCs w:val="32"/>
+              </w:rPr>
+            </w:pPr>
+            <w:r>
+              <w:rPr>
+                <w:rFonts w:cs="Arial"/>
+                <w:b/>
+                <w:color w:val="000000"/>
+                <w:sz w:val="28"/>
+                <w:szCs w:val="32"/>
+              </w:rPr>
+              <w:t>T.S.2.</w:t>
+            </w:r>
+            <w:r>
+              <w:rPr>
+                <w:rFonts w:cs="Arial"/>
+                <w:b/>
+                <w:color w:val="000000"/>
+                <w:sz w:val="28"/>
+                <w:szCs w:val="32"/>
+              </w:rPr>
+              <w:t>6.9.</w:t>
+            </w:r>
+            <w:r>
+              <w:rPr>
+                <w:rFonts w:cs="Arial"/>
+                <w:b/>
+                <w:color w:val="000000"/>
+                <w:sz w:val="28"/>
+                <w:szCs w:val="32"/>
+              </w:rPr>
+              <w:t>7</w:t>
+            </w:r>
+            <w:r>
+              <w:rPr>
+                <w:rFonts w:cs="Arial"/>
+                <w:b/>
+                <w:color w:val="000000"/>
+                <w:sz w:val="28"/>
+                <w:szCs w:val="32"/>
+              </w:rPr>
+              <w:t xml:space="preserve"> </w:t>
+            </w:r>
+            <w:r>
+              <w:rPr>
+                <w:rFonts w:cs="Arial"/>
+                <w:b/>
+                <w:color w:val="000000"/>
+                <w:sz w:val="28"/>
+                <w:szCs w:val="32"/>
+              </w:rPr>
+              <w:t>– Kramam</w:t>
+            </w:r>
+          </w:p>
+          <w:p>
+            <w:pPr>
+              <w:widowControl w:val="0"/>
+              <w:tabs>
+                <w:tab w:val="left" w:pos="993"/>
+              </w:tabs>
+              <w:autoSpaceDE w:val="0"/>
+              <w:autoSpaceDN w:val="0"/>
+              <w:adjustRightInd w:val="0"/>
+              <w:spacing w:before="0" w:line="240" w:lineRule="auto"/>
+              <w:ind w:right="297"/>
+              <w:rPr>
+                <w:rFonts w:cs="Arial"/>
+                <w:b/>
+                <w:color w:val="000000"/>
+                <w:sz w:val="28"/>
+                <w:szCs w:val="32"/>
+              </w:rPr>
+            </w:pPr>
+            <w:r>
+              <w:rPr>
+                <w:rFonts w:cs="Arial"/>
+                <w:b/>
+                <w:color w:val="000000"/>
+                <w:sz w:val="28"/>
+                <w:szCs w:val="32"/>
+              </w:rPr>
+              <w:t>Krama Vaakyam No.-</w:t>
+            </w:r>
+            <w:r>
+              <w:rPr>
+                <w:rFonts w:cs="Arial"/>
+                <w:b/>
+                <w:color w:val="000000"/>
+                <w:sz w:val="28"/>
+                <w:szCs w:val="32"/>
+              </w:rPr>
+              <w:t xml:space="preserve"> </w:t>
+            </w:r>
+            <w:r>
+              <w:rPr>
+                <w:rFonts w:cs="Arial"/>
+                <w:b/>
+                <w:color w:val="000000"/>
+                <w:sz w:val="28"/>
+                <w:szCs w:val="32"/>
+              </w:rPr>
+              <w:t>2</w:t>
+            </w:r>
+          </w:p>
+          <w:p>
+            <w:pPr>
+              <w:widowControl w:val="0"/>
+              <w:tabs>
+                <w:tab w:val="left" w:pos="993"/>
+              </w:tabs>
+              <w:autoSpaceDE w:val="0"/>
+              <w:autoSpaceDN w:val="0"/>
+              <w:adjustRightInd w:val="0"/>
+              <w:spacing w:before="0" w:line="240" w:lineRule="auto"/>
+              <w:ind w:right="297"/>
+              <w:rPr>
+                <w:rFonts w:cs="Arial"/>
+                <w:b/>
+                <w:color w:val="000000"/>
+                <w:sz w:val="28"/>
+                <w:szCs w:val="32"/>
+              </w:rPr>
+            </w:pPr>
+            <w:r>
+              <w:rPr>
+                <w:rFonts w:cs="Arial"/>
+                <w:b/>
+                <w:color w:val="000000"/>
+                <w:sz w:val="28"/>
+                <w:szCs w:val="32"/>
+              </w:rPr>
+              <w:t>Panchaati No</w:t>
+            </w:r>
+            <w:r>
+              <w:rPr>
+                <w:rFonts w:cs="Arial"/>
+                <w:b/>
+                <w:color w:val="000000"/>
+                <w:szCs w:val="32"/>
+              </w:rPr>
+              <w:t>. -</w:t>
+            </w:r>
+            <w:r>
+              <w:rPr>
+                <w:rFonts w:cs="Arial"/>
+                <w:b/>
+                <w:color w:val="000000"/>
+                <w:szCs w:val="32"/>
+              </w:rPr>
+              <w:t xml:space="preserve"> </w:t>
+            </w:r>
+            <w:r>
+              <w:rPr>
+                <w:rFonts w:cs="Arial"/>
+                <w:b/>
+                <w:color w:val="000000"/>
+                <w:sz w:val="28"/>
+                <w:szCs w:val="28"/>
+              </w:rPr>
+              <w:t>49</w:t>
+            </w:r>
+          </w:p>
+        </w:tc>
+        <w:tc>
+          <w:tcPr>
+            <w:tcW w:w="5386" w:type="dxa"/>
+          </w:tcPr>
+          <w:p>
+            <w:pPr>
+              <w:widowControl w:val="0"/>
+              <w:autoSpaceDE w:val="0"/>
+              <w:autoSpaceDN w:val="0"/>
+              <w:adjustRightInd w:val="0"/>
+              <w:spacing w:before="0" w:line="240" w:lineRule="auto"/>
+              <w:rPr>
+                <w:rFonts w:ascii="Latha" w:hAnsi="Latha" w:cs="Latha"/>
+                <w:sz w:val="28"/>
+                <w:szCs w:val="28"/>
+                <w:cs/>
+                <w:lang w:bidi="ta-IN"/>
+              </w:rPr>
+            </w:pPr>
+            <w:r>
+              <w:rPr>
+                <w:rFonts w:ascii="Latha" w:hAnsi="Latha" w:cs="Latha"/>
+                <w:sz w:val="28"/>
+                <w:szCs w:val="28"/>
+                <w:cs/>
+                <w:lang w:bidi="ta-IN"/>
+              </w:rPr>
+              <w:t>தா அ</w:t>
+            </w:r>
+            <w:r>
+              <w:rPr>
+                <w:rFonts w:ascii="BRH Tamil Tab Extra" w:hAnsi="BRH Tamil Tab Extra" w:cs="Latha"/>
+                <w:b/>
+                <w:sz w:val="36"/>
+                <w:szCs w:val="28"/>
+                <w:lang w:bidi="ta-IN"/>
+              </w:rPr>
+              <w:t>†</w:t>
+            </w:r>
+            <w:r>
+              <w:rPr>
+                <w:rFonts w:ascii="Latha" w:hAnsi="Latha" w:cs="Latha"/>
+                <w:sz w:val="28"/>
+                <w:szCs w:val="28"/>
+                <w:cs/>
+                <w:lang w:bidi="ta-IN"/>
+              </w:rPr>
+              <w:t>ரீர</w:t>
+            </w:r>
+            <w:r>
+              <w:rPr>
+                <w:rFonts w:ascii="Latha" w:hAnsi="Latha" w:cs="Latha"/>
+                <w:sz w:val="28"/>
+                <w:szCs w:val="28"/>
+                <w:highlight w:val="yellow"/>
+                <w:cs/>
+                <w:lang w:bidi="ta-IN"/>
+              </w:rPr>
+              <w:t>தா</w:t>
+            </w:r>
+            <w:r>
+              <w:rPr>
+                <w:rFonts w:ascii="BRH Tamil Tab Extra" w:hAnsi="BRH Tamil Tab Extra" w:cs="Latha"/>
+                <w:b/>
+                <w:sz w:val="32"/>
+                <w:szCs w:val="28"/>
+                <w:highlight w:val="yellow"/>
+                <w:lang w:bidi="ta-IN"/>
+              </w:rPr>
+              <w:t>…</w:t>
+            </w:r>
+            <w:r>
+              <w:rPr>
+                <w:rFonts w:ascii="Latha" w:hAnsi="Latha" w:cs="Latha"/>
+                <w:b/>
+                <w:bCs/>
+                <w:position w:val="-12"/>
+                <w:sz w:val="28"/>
+                <w:szCs w:val="28"/>
+                <w:highlight w:val="yellow"/>
+                <w:cs/>
+                <w:lang w:bidi="ta-IN"/>
+              </w:rPr>
+              <w:t>4</w:t>
+            </w:r>
+            <w:r>
+              <w:rPr>
+                <w:rFonts w:ascii="Latha" w:hAnsi="Latha" w:cs="Latha"/>
+                <w:sz w:val="28"/>
+                <w:szCs w:val="28"/>
+                <w:highlight w:val="yellow"/>
+                <w:cs/>
+                <w:lang w:bidi="ta-IN"/>
+              </w:rPr>
+              <w:t>ம</w:t>
+            </w:r>
+            <w:r>
+              <w:rPr>
+                <w:rFonts w:ascii="Latha" w:hAnsi="Latha" w:cs="Latha"/>
+                <w:sz w:val="28"/>
+                <w:szCs w:val="28"/>
+                <w:cs/>
+                <w:lang w:bidi="ta-IN"/>
+              </w:rPr>
+              <w:t xml:space="preserve"> </w:t>
+            </w:r>
+            <w:r>
+              <w:rPr>
+                <w:rFonts w:ascii="Latha" w:hAnsi="Latha" w:cs="Latha"/>
+                <w:sz w:val="28"/>
+                <w:szCs w:val="28"/>
+                <w:lang w:bidi="ta-IN"/>
+              </w:rPr>
+              <w:t xml:space="preserve">| </w:t>
+            </w:r>
+            <w:r>
+              <w:rPr>
+                <w:rFonts w:ascii="Latha" w:hAnsi="Latha" w:cs="Latha"/>
+                <w:sz w:val="28"/>
+                <w:szCs w:val="28"/>
+                <w:cs/>
+                <w:lang w:bidi="ta-IN"/>
+              </w:rPr>
+              <w:t>அ</w:t>
+            </w:r>
+            <w:r>
+              <w:rPr>
+                <w:rFonts w:ascii="BRH Tamil Tab Extra" w:hAnsi="BRH Tamil Tab Extra" w:cs="Latha"/>
+                <w:b/>
+                <w:sz w:val="32"/>
+                <w:szCs w:val="28"/>
+                <w:lang w:bidi="ta-IN"/>
+              </w:rPr>
+              <w:t>…</w:t>
+            </w:r>
+            <w:r>
+              <w:rPr>
+                <w:rFonts w:ascii="Latha" w:hAnsi="Latha" w:cs="Latha"/>
+                <w:sz w:val="28"/>
+                <w:szCs w:val="28"/>
+                <w:cs/>
+                <w:lang w:bidi="ta-IN"/>
+              </w:rPr>
+              <w:t>ரீ</w:t>
+            </w:r>
+            <w:r>
+              <w:rPr>
+                <w:rFonts w:ascii="BRH Tamil Tab Extra" w:hAnsi="BRH Tamil Tab Extra" w:cs="Latha"/>
+                <w:b/>
+                <w:sz w:val="32"/>
+                <w:szCs w:val="28"/>
+                <w:lang w:bidi="ta-IN"/>
+              </w:rPr>
+              <w:t>…</w:t>
+            </w:r>
+            <w:r>
+              <w:rPr>
+                <w:rFonts w:ascii="Latha" w:hAnsi="Latha" w:cs="Latha"/>
+                <w:sz w:val="28"/>
+                <w:szCs w:val="28"/>
+                <w:cs/>
+                <w:lang w:bidi="ta-IN"/>
+              </w:rPr>
+              <w:t>ர</w:t>
+            </w:r>
+            <w:r>
+              <w:rPr>
+                <w:rFonts w:ascii="BRH Tamil Tab Extra" w:hAnsi="BRH Tamil Tab Extra" w:cs="Latha"/>
+                <w:b/>
+                <w:sz w:val="32"/>
+                <w:szCs w:val="28"/>
+                <w:lang w:bidi="ta-IN"/>
+              </w:rPr>
+              <w:t>…</w:t>
+            </w:r>
+            <w:r>
+              <w:rPr>
+                <w:rFonts w:ascii="Latha" w:hAnsi="Latha" w:cs="Latha"/>
+                <w:sz w:val="28"/>
+                <w:szCs w:val="28"/>
+                <w:cs/>
+                <w:lang w:bidi="ta-IN"/>
+              </w:rPr>
+              <w:t>தா</w:t>
+            </w:r>
+            <w:r>
+              <w:rPr>
+                <w:rFonts w:ascii="BRH Tamil Tab Extra" w:hAnsi="BRH Tamil Tab Extra" w:cs="Latha"/>
+                <w:b/>
+                <w:sz w:val="32"/>
+                <w:szCs w:val="28"/>
+                <w:lang w:bidi="ta-IN"/>
+              </w:rPr>
+              <w:t>…</w:t>
+            </w:r>
+            <w:r>
+              <w:rPr>
+                <w:rFonts w:ascii="Latha" w:hAnsi="Latha" w:cs="Latha"/>
+                <w:b/>
+                <w:bCs/>
+                <w:position w:val="-12"/>
+                <w:sz w:val="28"/>
+                <w:szCs w:val="28"/>
+                <w:cs/>
+                <w:lang w:bidi="ta-IN"/>
+              </w:rPr>
+              <w:t>4</w:t>
+            </w:r>
+            <w:r>
+              <w:rPr>
+                <w:rFonts w:ascii="Latha" w:hAnsi="Latha" w:cs="Latha"/>
+                <w:sz w:val="28"/>
+                <w:szCs w:val="28"/>
+                <w:cs/>
+                <w:lang w:bidi="ta-IN"/>
+              </w:rPr>
+              <w:t>மேதி</w:t>
+            </w:r>
+            <w:r>
+              <w:rPr>
+                <w:rFonts w:ascii="BRH Tamil Tab Extra" w:hAnsi="BRH Tamil Tab Extra" w:cs="Latha"/>
+                <w:b/>
+                <w:sz w:val="36"/>
+                <w:szCs w:val="28"/>
+                <w:lang w:bidi="ta-IN"/>
+              </w:rPr>
+              <w:t>†</w:t>
+            </w:r>
+            <w:r>
+              <w:rPr>
+                <w:rFonts w:ascii="Latha" w:hAnsi="Latha" w:cs="Latha"/>
+                <w:sz w:val="28"/>
+                <w:szCs w:val="28"/>
+                <w:lang w:bidi="ta-IN"/>
+              </w:rPr>
+              <w:t xml:space="preserve"> |</w:t>
+            </w:r>
+          </w:p>
+        </w:tc>
+        <w:tc>
+          <w:tcPr>
+            <w:tcW w:w="5220" w:type="dxa"/>
+          </w:tcPr>
+          <w:p>
+            <w:pPr>
+              <w:widowControl w:val="0"/>
+              <w:autoSpaceDE w:val="0"/>
+              <w:autoSpaceDN w:val="0"/>
+              <w:adjustRightInd w:val="0"/>
+              <w:spacing w:before="0" w:line="240" w:lineRule="auto"/>
+              <w:rPr>
+                <w:rFonts w:ascii="Latha" w:hAnsi="Latha" w:cs="Latha"/>
+                <w:sz w:val="28"/>
+                <w:szCs w:val="28"/>
+                <w:cs/>
+                <w:lang w:bidi="ta-IN"/>
+              </w:rPr>
+            </w:pPr>
+            <w:r>
+              <w:rPr>
+                <w:rFonts w:ascii="Latha" w:hAnsi="Latha" w:cs="Latha"/>
+                <w:sz w:val="28"/>
+                <w:szCs w:val="28"/>
+                <w:cs/>
+                <w:lang w:bidi="ta-IN"/>
+              </w:rPr>
+              <w:t>தா அ</w:t>
+            </w:r>
+            <w:r>
+              <w:rPr>
+                <w:rFonts w:ascii="BRH Tamil Tab Extra" w:hAnsi="BRH Tamil Tab Extra" w:cs="Latha"/>
+                <w:b/>
+                <w:sz w:val="36"/>
+                <w:szCs w:val="28"/>
+                <w:lang w:bidi="ta-IN"/>
+              </w:rPr>
+              <w:t>†</w:t>
+            </w:r>
+            <w:r>
+              <w:rPr>
+                <w:rFonts w:ascii="Latha" w:hAnsi="Latha" w:cs="Latha"/>
+                <w:sz w:val="28"/>
+                <w:szCs w:val="28"/>
+                <w:cs/>
+                <w:lang w:bidi="ta-IN"/>
+              </w:rPr>
+              <w:t>ரீர</w:t>
+            </w:r>
+            <w:r>
+              <w:rPr>
+                <w:rFonts w:ascii="Latha" w:hAnsi="Latha" w:cs="Latha"/>
+                <w:sz w:val="28"/>
+                <w:szCs w:val="28"/>
+                <w:highlight w:val="green"/>
+                <w:cs/>
+                <w:lang w:bidi="ta-IN"/>
+              </w:rPr>
+              <w:t>தா</w:t>
+            </w:r>
+            <w:r>
+              <w:rPr>
+                <w:rFonts w:ascii="Latha" w:hAnsi="Latha" w:cs="Latha"/>
+                <w:b/>
+                <w:bCs/>
+                <w:position w:val="-12"/>
+                <w:sz w:val="28"/>
+                <w:szCs w:val="28"/>
+                <w:highlight w:val="green"/>
+                <w:cs/>
+                <w:lang w:bidi="ta-IN"/>
+              </w:rPr>
+              <w:t>4</w:t>
+            </w:r>
+            <w:r>
+              <w:rPr>
+                <w:rFonts w:ascii="Latha" w:hAnsi="Latha" w:cs="Latha"/>
+                <w:sz w:val="28"/>
+                <w:szCs w:val="28"/>
+                <w:highlight w:val="green"/>
+                <w:cs/>
+                <w:lang w:bidi="ta-IN"/>
+              </w:rPr>
+              <w:t>ம</w:t>
+            </w:r>
+            <w:r>
+              <w:rPr>
+                <w:rFonts w:ascii="Latha" w:hAnsi="Latha" w:cs="Latha"/>
+                <w:sz w:val="28"/>
+                <w:szCs w:val="28"/>
+                <w:cs/>
+                <w:lang w:bidi="ta-IN"/>
+              </w:rPr>
+              <w:t xml:space="preserve"> </w:t>
+            </w:r>
+            <w:r>
+              <w:rPr>
+                <w:rFonts w:ascii="Latha" w:hAnsi="Latha" w:cs="Latha"/>
+                <w:sz w:val="28"/>
+                <w:szCs w:val="28"/>
+                <w:lang w:bidi="ta-IN"/>
+              </w:rPr>
+              <w:t xml:space="preserve">| </w:t>
+            </w:r>
+            <w:r>
+              <w:rPr>
+                <w:rFonts w:ascii="Latha" w:hAnsi="Latha" w:cs="Latha"/>
+                <w:sz w:val="28"/>
+                <w:szCs w:val="28"/>
+                <w:cs/>
+                <w:lang w:bidi="ta-IN"/>
+              </w:rPr>
+              <w:t>அ</w:t>
+            </w:r>
+            <w:r>
+              <w:rPr>
+                <w:rFonts w:ascii="BRH Tamil Tab Extra" w:hAnsi="BRH Tamil Tab Extra" w:cs="Latha"/>
+                <w:b/>
+                <w:sz w:val="32"/>
+                <w:szCs w:val="28"/>
+                <w:lang w:bidi="ta-IN"/>
+              </w:rPr>
+              <w:t>…</w:t>
+            </w:r>
+            <w:r>
+              <w:rPr>
+                <w:rFonts w:ascii="Latha" w:hAnsi="Latha" w:cs="Latha"/>
+                <w:sz w:val="28"/>
+                <w:szCs w:val="28"/>
+                <w:cs/>
+                <w:lang w:bidi="ta-IN"/>
+              </w:rPr>
+              <w:t>ரீ</w:t>
+            </w:r>
+            <w:r>
+              <w:rPr>
+                <w:rFonts w:ascii="BRH Tamil Tab Extra" w:hAnsi="BRH Tamil Tab Extra" w:cs="Latha"/>
+                <w:b/>
+                <w:sz w:val="32"/>
+                <w:szCs w:val="28"/>
+                <w:lang w:bidi="ta-IN"/>
+              </w:rPr>
+              <w:t>…</w:t>
+            </w:r>
+            <w:r>
+              <w:rPr>
+                <w:rFonts w:ascii="Latha" w:hAnsi="Latha" w:cs="Latha"/>
+                <w:sz w:val="28"/>
+                <w:szCs w:val="28"/>
+                <w:cs/>
+                <w:lang w:bidi="ta-IN"/>
+              </w:rPr>
+              <w:t>ர</w:t>
+            </w:r>
+            <w:r>
+              <w:rPr>
+                <w:rFonts w:ascii="BRH Tamil Tab Extra" w:hAnsi="BRH Tamil Tab Extra" w:cs="Latha"/>
+                <w:b/>
+                <w:sz w:val="32"/>
+                <w:szCs w:val="28"/>
+                <w:lang w:bidi="ta-IN"/>
+              </w:rPr>
+              <w:t>…</w:t>
+            </w:r>
+            <w:r>
+              <w:rPr>
+                <w:rFonts w:ascii="Latha" w:hAnsi="Latha" w:cs="Latha"/>
+                <w:sz w:val="28"/>
+                <w:szCs w:val="28"/>
+                <w:cs/>
+                <w:lang w:bidi="ta-IN"/>
+              </w:rPr>
+              <w:t>தா</w:t>
+            </w:r>
+            <w:r>
+              <w:rPr>
+                <w:rFonts w:ascii="BRH Tamil Tab Extra" w:hAnsi="BRH Tamil Tab Extra" w:cs="Latha"/>
+                <w:b/>
+                <w:sz w:val="32"/>
+                <w:szCs w:val="28"/>
+                <w:lang w:bidi="ta-IN"/>
+              </w:rPr>
+              <w:t>…</w:t>
+            </w:r>
+            <w:r>
+              <w:rPr>
+                <w:rFonts w:ascii="Latha" w:hAnsi="Latha" w:cs="Latha"/>
+                <w:b/>
+                <w:bCs/>
+                <w:position w:val="-12"/>
+                <w:sz w:val="28"/>
+                <w:szCs w:val="28"/>
+                <w:cs/>
+                <w:lang w:bidi="ta-IN"/>
+              </w:rPr>
+              <w:t>4</w:t>
+            </w:r>
+            <w:r>
+              <w:rPr>
+                <w:rFonts w:ascii="Latha" w:hAnsi="Latha" w:cs="Latha"/>
+                <w:sz w:val="28"/>
+                <w:szCs w:val="28"/>
+                <w:cs/>
+                <w:lang w:bidi="ta-IN"/>
+              </w:rPr>
+              <w:t>மேதி</w:t>
+            </w:r>
+            <w:r>
+              <w:rPr>
+                <w:rFonts w:ascii="BRH Tamil Tab Extra" w:hAnsi="BRH Tamil Tab Extra" w:cs="Latha"/>
+                <w:b/>
+                <w:sz w:val="36"/>
+                <w:szCs w:val="28"/>
+                <w:lang w:bidi="ta-IN"/>
+              </w:rPr>
+              <w:t>†</w:t>
+            </w:r>
+            <w:r>
+              <w:rPr>
+                <w:rFonts w:ascii="Latha" w:hAnsi="Latha" w:cs="Latha"/>
+                <w:sz w:val="28"/>
+                <w:szCs w:val="28"/>
+                <w:lang w:bidi="ta-IN"/>
+              </w:rPr>
+              <w:t xml:space="preserve"> |</w:t>
+            </w:r>
+          </w:p>
+        </w:tc>
+      </w:tr>
+      <w:tr>
+        <w:trPr>
+          <w:trHeight w:val="1091"/>
+        </w:trPr>
+        <w:tc>
+          <w:tcPr>
+            <w:tcW w:w="4048" w:type="dxa"/>
+          </w:tcPr>
+          <w:p>
+            <w:pPr>
+              <w:widowControl w:val="0"/>
+              <w:tabs>
+                <w:tab w:val="left" w:pos="993"/>
+              </w:tabs>
+              <w:autoSpaceDE w:val="0"/>
+              <w:autoSpaceDN w:val="0"/>
+              <w:adjustRightInd w:val="0"/>
+              <w:spacing w:before="0" w:line="240" w:lineRule="auto"/>
+              <w:ind w:right="297"/>
+              <w:rPr>
+                <w:rFonts w:cs="Arial"/>
+                <w:b/>
+                <w:color w:val="000000"/>
+                <w:sz w:val="28"/>
+                <w:szCs w:val="32"/>
+              </w:rPr>
+            </w:pPr>
+            <w:r>
+              <w:rPr>
+                <w:rFonts w:cs="Arial"/>
+                <w:b/>
+                <w:color w:val="000000"/>
+                <w:sz w:val="28"/>
+                <w:szCs w:val="32"/>
+              </w:rPr>
+              <w:t>T.S.2.</w:t>
+            </w:r>
+            <w:r>
+              <w:rPr>
+                <w:rFonts w:cs="Arial"/>
+                <w:b/>
+                <w:color w:val="000000"/>
+                <w:sz w:val="28"/>
+                <w:szCs w:val="32"/>
+              </w:rPr>
+              <w:t>6.</w:t>
+            </w:r>
+            <w:r>
+              <w:rPr>
+                <w:rFonts w:cs="Arial"/>
+                <w:b/>
+                <w:color w:val="000000"/>
+                <w:sz w:val="28"/>
+                <w:szCs w:val="32"/>
+              </w:rPr>
+              <w:t>11.2</w:t>
+            </w:r>
+            <w:r>
+              <w:rPr>
+                <w:rFonts w:cs="Arial"/>
+                <w:b/>
+                <w:color w:val="000000"/>
+                <w:sz w:val="28"/>
+                <w:szCs w:val="32"/>
+              </w:rPr>
+              <w:t xml:space="preserve"> </w:t>
+            </w:r>
+            <w:r>
+              <w:rPr>
+                <w:rFonts w:cs="Arial"/>
+                <w:b/>
+                <w:color w:val="000000"/>
+                <w:sz w:val="28"/>
+                <w:szCs w:val="32"/>
+              </w:rPr>
+              <w:t>– Kramam</w:t>
+            </w:r>
+          </w:p>
+          <w:p>
+            <w:pPr>
+              <w:widowControl w:val="0"/>
+              <w:tabs>
+                <w:tab w:val="left" w:pos="993"/>
+              </w:tabs>
+              <w:autoSpaceDE w:val="0"/>
+              <w:autoSpaceDN w:val="0"/>
+              <w:adjustRightInd w:val="0"/>
+              <w:spacing w:before="0" w:line="240" w:lineRule="auto"/>
+              <w:ind w:right="297"/>
+              <w:rPr>
+                <w:rFonts w:cs="Arial"/>
+                <w:b/>
+                <w:color w:val="000000"/>
+                <w:sz w:val="28"/>
+                <w:szCs w:val="32"/>
+              </w:rPr>
+            </w:pPr>
+            <w:r>
+              <w:rPr>
+                <w:rFonts w:cs="Arial"/>
+                <w:b/>
+                <w:color w:val="000000"/>
+                <w:sz w:val="28"/>
+                <w:szCs w:val="32"/>
+              </w:rPr>
+              <w:t>Krama Vaakyam No.-</w:t>
+            </w:r>
+            <w:r>
+              <w:rPr>
+                <w:rFonts w:cs="Arial"/>
+                <w:b/>
+                <w:color w:val="000000"/>
+                <w:sz w:val="28"/>
+                <w:szCs w:val="32"/>
+              </w:rPr>
+              <w:t xml:space="preserve"> </w:t>
+            </w:r>
+            <w:r>
+              <w:rPr>
+                <w:rFonts w:cs="Arial"/>
+                <w:b/>
+                <w:color w:val="000000"/>
+                <w:sz w:val="28"/>
+                <w:szCs w:val="32"/>
+              </w:rPr>
+              <w:t>14</w:t>
+            </w:r>
+          </w:p>
+          <w:p>
+            <w:pPr>
+              <w:widowControl w:val="0"/>
+              <w:tabs>
+                <w:tab w:val="left" w:pos="993"/>
+              </w:tabs>
+              <w:autoSpaceDE w:val="0"/>
+              <w:autoSpaceDN w:val="0"/>
+              <w:adjustRightInd w:val="0"/>
+              <w:spacing w:before="0" w:line="240" w:lineRule="auto"/>
+              <w:ind w:right="297"/>
+              <w:rPr>
+                <w:rFonts w:cs="Arial"/>
+                <w:b/>
+                <w:color w:val="000000"/>
+                <w:sz w:val="28"/>
+                <w:szCs w:val="32"/>
+              </w:rPr>
+            </w:pPr>
+            <w:r>
+              <w:rPr>
+                <w:rFonts w:cs="Arial"/>
+                <w:b/>
+                <w:color w:val="000000"/>
+                <w:sz w:val="28"/>
+                <w:szCs w:val="32"/>
+              </w:rPr>
+              <w:t>Panchaati No</w:t>
+            </w:r>
+            <w:r>
+              <w:rPr>
+                <w:rFonts w:cs="Arial"/>
+                <w:b/>
+                <w:color w:val="000000"/>
+                <w:szCs w:val="32"/>
+              </w:rPr>
+              <w:t>. -</w:t>
+            </w:r>
+            <w:r>
+              <w:rPr>
+                <w:rFonts w:cs="Arial"/>
+                <w:b/>
+                <w:color w:val="000000"/>
+                <w:sz w:val="28"/>
+                <w:szCs w:val="28"/>
+              </w:rPr>
+              <w:t xml:space="preserve"> </w:t>
+            </w:r>
+            <w:r>
+              <w:rPr>
+                <w:rFonts w:cs="Arial"/>
+                <w:b/>
+                <w:color w:val="000000"/>
+                <w:sz w:val="28"/>
+                <w:szCs w:val="28"/>
+              </w:rPr>
+              <w:t>62</w:t>
+            </w:r>
+          </w:p>
+        </w:tc>
+        <w:tc>
+          <w:tcPr>
+            <w:tcW w:w="5386" w:type="dxa"/>
+          </w:tcPr>
+          <w:p>
+            <w:pPr>
+              <w:widowControl w:val="0"/>
+              <w:autoSpaceDE w:val="0"/>
+              <w:autoSpaceDN w:val="0"/>
+              <w:adjustRightInd w:val="0"/>
+              <w:spacing w:before="0" w:line="240" w:lineRule="auto"/>
+              <w:rPr>
+                <w:rFonts w:ascii="Latha" w:hAnsi="Latha" w:cs="Latha"/>
+                <w:sz w:val="28"/>
+                <w:szCs w:val="28"/>
+                <w:cs/>
+                <w:lang w:bidi="ta-IN"/>
+              </w:rPr>
+            </w:pPr>
+            <w:r>
+              <w:rPr>
+                <w:rFonts w:ascii="Latha" w:hAnsi="Latha" w:cs="Latha"/>
+                <w:sz w:val="28"/>
+                <w:szCs w:val="28"/>
+                <w:cs/>
+                <w:lang w:bidi="ta-IN"/>
+              </w:rPr>
+              <w:t>கமு</w:t>
+            </w:r>
+            <w:r>
+              <w:rPr>
+                <w:rFonts w:ascii="BRH Tamil Tab Extra" w:hAnsi="BRH Tamil Tab Extra" w:cs="Latha"/>
+                <w:b/>
+                <w:sz w:val="36"/>
+                <w:szCs w:val="28"/>
+                <w:highlight w:val="yellow"/>
+                <w:lang w:bidi="ta-IN"/>
+              </w:rPr>
+              <w:t>†</w:t>
+            </w:r>
+            <w:r>
+              <w:rPr>
+                <w:rFonts w:ascii="Latha" w:hAnsi="Latha" w:cs="Latha"/>
+                <w:sz w:val="28"/>
+                <w:szCs w:val="28"/>
+                <w:lang w:bidi="ta-IN"/>
+              </w:rPr>
+              <w:t xml:space="preserve"> | </w:t>
+            </w:r>
+            <w:r>
+              <w:rPr>
+                <w:rFonts w:ascii="Latha" w:hAnsi="Latha" w:cs="Latha"/>
+                <w:sz w:val="28"/>
+                <w:szCs w:val="28"/>
+                <w:highlight w:val="yellow"/>
+                <w:cs/>
+                <w:lang w:bidi="ta-IN"/>
+              </w:rPr>
+              <w:t>உ</w:t>
+            </w:r>
+            <w:r>
+              <w:rPr>
+                <w:rFonts w:ascii="BRH Tamil Tab Extra" w:hAnsi="BRH Tamil Tab Extra" w:cs="Latha"/>
+                <w:b/>
+                <w:sz w:val="32"/>
+                <w:szCs w:val="28"/>
+                <w:highlight w:val="yellow"/>
+                <w:lang w:bidi="ta-IN"/>
+              </w:rPr>
+              <w:t>…</w:t>
+            </w:r>
+            <w:r>
+              <w:rPr>
+                <w:rFonts w:ascii="Latha" w:hAnsi="Latha" w:cs="Latha"/>
+                <w:sz w:val="28"/>
+                <w:szCs w:val="28"/>
+                <w:highlight w:val="yellow"/>
+                <w:lang w:bidi="ta-IN"/>
+              </w:rPr>
+              <w:t xml:space="preserve"> </w:t>
+            </w:r>
+            <w:r>
+              <w:rPr>
+                <w:rFonts w:ascii="Latha" w:hAnsi="Latha" w:cs="Latha"/>
+                <w:sz w:val="28"/>
+                <w:szCs w:val="28"/>
+                <w:highlight w:val="yellow"/>
+                <w:cs/>
+                <w:lang w:bidi="ta-IN"/>
+              </w:rPr>
+              <w:t>ஸ்</w:t>
+            </w:r>
+            <w:r>
+              <w:rPr>
+                <w:rFonts w:ascii="Latha" w:hAnsi="Latha" w:cs="Latha"/>
+                <w:sz w:val="28"/>
+                <w:szCs w:val="28"/>
+                <w:cs/>
+                <w:lang w:bidi="ta-IN"/>
+              </w:rPr>
+              <w:t>வி</w:t>
+            </w:r>
+            <w:r>
+              <w:rPr>
+                <w:rFonts w:ascii="BRH Tamil Tab Extra" w:hAnsi="BRH Tamil Tab Extra" w:cs="Latha"/>
+                <w:b/>
+                <w:sz w:val="32"/>
+                <w:szCs w:val="28"/>
+                <w:lang w:bidi="ta-IN"/>
+              </w:rPr>
+              <w:t>…</w:t>
+            </w:r>
+            <w:r>
+              <w:rPr>
+                <w:rFonts w:ascii="Latha" w:hAnsi="Latha" w:cs="Latha"/>
+                <w:sz w:val="28"/>
+                <w:szCs w:val="28"/>
+                <w:cs/>
+                <w:lang w:bidi="ta-IN"/>
+              </w:rPr>
+              <w:t>த்</w:t>
+            </w:r>
+            <w:r>
+              <w:rPr>
+                <w:rFonts w:ascii="BRH Tamil Tab Extra" w:hAnsi="BRH Tamil Tab Extra" w:cs="Latha"/>
+                <w:b/>
+                <w:sz w:val="32"/>
+                <w:szCs w:val="28"/>
+                <w:lang w:bidi="ta-IN"/>
+              </w:rPr>
+              <w:t>…</w:t>
+            </w:r>
+            <w:r>
+              <w:rPr>
+                <w:rFonts w:ascii="Latha" w:hAnsi="Latha" w:cs="Latha"/>
+                <w:sz w:val="28"/>
+                <w:szCs w:val="28"/>
+                <w:lang w:bidi="ta-IN"/>
+              </w:rPr>
+              <w:t xml:space="preserve"> |</w:t>
+            </w:r>
+          </w:p>
+        </w:tc>
+        <w:tc>
+          <w:tcPr>
+            <w:tcW w:w="5220" w:type="dxa"/>
+          </w:tcPr>
+          <w:p>
+            <w:pPr>
+              <w:widowControl w:val="0"/>
+              <w:autoSpaceDE w:val="0"/>
+              <w:autoSpaceDN w:val="0"/>
+              <w:adjustRightInd w:val="0"/>
+              <w:spacing w:before="0" w:line="240" w:lineRule="auto"/>
+              <w:rPr>
+                <w:rFonts w:ascii="Latha" w:hAnsi="Latha" w:cs="Latha"/>
+                <w:sz w:val="28"/>
+                <w:szCs w:val="28"/>
+                <w:cs/>
+                <w:lang w:bidi="ta-IN"/>
+              </w:rPr>
+            </w:pPr>
+            <w:r>
+              <w:rPr>
+                <w:rFonts w:ascii="Latha" w:hAnsi="Latha" w:cs="Latha"/>
+                <w:sz w:val="28"/>
+                <w:szCs w:val="28"/>
+                <w:cs/>
+                <w:lang w:bidi="ta-IN"/>
+              </w:rPr>
+              <w:t>கமு</w:t>
+            </w:r>
+            <w:r>
+              <w:rPr>
+                <w:rFonts w:ascii="BRH Tamil Tab Extra" w:hAnsi="BRH Tamil Tab Extra" w:cs="Latha"/>
+                <w:b/>
+                <w:sz w:val="36"/>
+                <w:szCs w:val="28"/>
+                <w:highlight w:val="yellow"/>
+                <w:lang w:bidi="ta-IN"/>
+              </w:rPr>
+              <w:t>†</w:t>
+            </w:r>
+            <w:r>
+              <w:rPr>
+                <w:rFonts w:ascii="Latha" w:hAnsi="Latha" w:cs="Latha"/>
+                <w:sz w:val="28"/>
+                <w:szCs w:val="28"/>
+                <w:lang w:bidi="ta-IN"/>
+              </w:rPr>
+              <w:t xml:space="preserve"> | </w:t>
+            </w:r>
+            <w:r>
+              <w:rPr>
+                <w:rFonts w:ascii="Latha" w:hAnsi="Latha" w:cs="Latha" w:hint="cs"/>
+                <w:sz w:val="28"/>
+                <w:szCs w:val="28"/>
+                <w:highlight w:val="green"/>
+                <w:cs/>
+                <w:lang w:bidi="ta-IN"/>
+              </w:rPr>
+              <w:t>ஊ</w:t>
+            </w:r>
+            <w:r>
+              <w:rPr>
+                <w:rFonts w:ascii="BRH Tamil Tab Extra" w:hAnsi="BRH Tamil Tab Extra" w:cs="Latha"/>
+                <w:b/>
+                <w:sz w:val="32"/>
+                <w:szCs w:val="28"/>
+                <w:highlight w:val="green"/>
+                <w:lang w:bidi="ta-IN"/>
+              </w:rPr>
+              <w:t>…</w:t>
+            </w:r>
+            <w:r>
+              <w:rPr>
+                <w:rFonts w:ascii="Latha" w:hAnsi="Latha" w:cs="Latha"/>
+                <w:sz w:val="28"/>
+                <w:szCs w:val="28"/>
+                <w:highlight w:val="green"/>
+                <w:lang w:bidi="ta-IN"/>
+              </w:rPr>
+              <w:t xml:space="preserve"> </w:t>
+            </w:r>
+            <w:r>
+              <w:rPr>
+                <w:rFonts w:ascii="Latha" w:hAnsi="Latha" w:cs="Latha"/>
+                <w:sz w:val="28"/>
+                <w:szCs w:val="28"/>
+                <w:highlight w:val="green"/>
+                <w:cs/>
+                <w:lang w:bidi="ta-IN"/>
+              </w:rPr>
+              <w:t>ஸ்</w:t>
+            </w:r>
+            <w:r>
+              <w:rPr>
+                <w:rFonts w:ascii="Latha" w:hAnsi="Latha" w:cs="Latha"/>
+                <w:sz w:val="28"/>
+                <w:szCs w:val="28"/>
+                <w:cs/>
+                <w:lang w:bidi="ta-IN"/>
+              </w:rPr>
+              <w:t>வி</w:t>
+            </w:r>
+            <w:r>
+              <w:rPr>
+                <w:rFonts w:ascii="BRH Tamil Tab Extra" w:hAnsi="BRH Tamil Tab Extra" w:cs="Latha"/>
+                <w:b/>
+                <w:sz w:val="32"/>
+                <w:szCs w:val="28"/>
+                <w:lang w:bidi="ta-IN"/>
+              </w:rPr>
+              <w:t>…</w:t>
+            </w:r>
+            <w:r>
+              <w:rPr>
+                <w:rFonts w:ascii="Latha" w:hAnsi="Latha" w:cs="Latha"/>
+                <w:sz w:val="28"/>
+                <w:szCs w:val="28"/>
+                <w:cs/>
+                <w:lang w:bidi="ta-IN"/>
+              </w:rPr>
+              <w:t>த்</w:t>
+            </w:r>
+            <w:r>
+              <w:rPr>
+                <w:rFonts w:ascii="BRH Tamil Tab Extra" w:hAnsi="BRH Tamil Tab Extra" w:cs="Latha"/>
+                <w:b/>
+                <w:sz w:val="32"/>
+                <w:szCs w:val="28"/>
+                <w:lang w:bidi="ta-IN"/>
+              </w:rPr>
+              <w:t>…</w:t>
+            </w:r>
+            <w:r>
+              <w:rPr>
+                <w:rFonts w:ascii="Latha" w:hAnsi="Latha" w:cs="Latha"/>
+                <w:sz w:val="28"/>
+                <w:szCs w:val="28"/>
+                <w:lang w:bidi="ta-IN"/>
+              </w:rPr>
+              <w:t xml:space="preserve"> |</w:t>
+            </w:r>
+          </w:p>
+        </w:tc>
+      </w:tr>
+      <w:tr>
+        <w:trPr>
+          <w:trHeight w:val="1091"/>
+        </w:trPr>
+        <w:tc>
+          <w:tcPr>
+            <w:tcW w:w="4048" w:type="dxa"/>
+          </w:tcPr>
+          <w:p>
+            <w:pPr>
+              <w:widowControl w:val="0"/>
+              <w:tabs>
+                <w:tab w:val="left" w:pos="993"/>
+              </w:tabs>
+              <w:autoSpaceDE w:val="0"/>
+              <w:autoSpaceDN w:val="0"/>
+              <w:adjustRightInd w:val="0"/>
+              <w:spacing w:before="0" w:line="240" w:lineRule="auto"/>
+              <w:ind w:right="297"/>
+              <w:rPr>
+                <w:rFonts w:cs="Arial"/>
+                <w:b/>
+                <w:color w:val="000000"/>
+                <w:sz w:val="28"/>
+                <w:szCs w:val="32"/>
+              </w:rPr>
+            </w:pPr>
+            <w:r>
+              <w:rPr>
+                <w:rFonts w:cs="Arial"/>
+                <w:b/>
+                <w:color w:val="000000"/>
+                <w:sz w:val="28"/>
+                <w:szCs w:val="32"/>
+              </w:rPr>
+              <w:lastRenderedPageBreak/>
+              <w:t>T.S.2.</w:t>
+            </w:r>
+            <w:r>
+              <w:rPr>
+                <w:rFonts w:cs="Arial"/>
+                <w:b/>
+                <w:color w:val="000000"/>
+                <w:sz w:val="28"/>
+                <w:szCs w:val="32"/>
+              </w:rPr>
+              <w:t xml:space="preserve">6.11.2 </w:t>
+            </w:r>
+            <w:r>
+              <w:rPr>
+                <w:rFonts w:cs="Arial"/>
+                <w:b/>
+                <w:color w:val="000000"/>
+                <w:sz w:val="28"/>
+                <w:szCs w:val="32"/>
+              </w:rPr>
+              <w:t>– Kramam</w:t>
+            </w:r>
+          </w:p>
+          <w:p>
+            <w:pPr>
+              <w:widowControl w:val="0"/>
+              <w:tabs>
+                <w:tab w:val="left" w:pos="993"/>
+              </w:tabs>
+              <w:autoSpaceDE w:val="0"/>
+              <w:autoSpaceDN w:val="0"/>
+              <w:adjustRightInd w:val="0"/>
+              <w:spacing w:before="0" w:line="240" w:lineRule="auto"/>
+              <w:ind w:right="297"/>
+              <w:rPr>
+                <w:rFonts w:cs="Arial"/>
+                <w:b/>
+                <w:color w:val="000000"/>
+                <w:sz w:val="28"/>
+                <w:szCs w:val="32"/>
+              </w:rPr>
+            </w:pPr>
+            <w:r>
+              <w:rPr>
+                <w:rFonts w:cs="Arial"/>
+                <w:b/>
+                <w:color w:val="000000"/>
+                <w:sz w:val="28"/>
+                <w:szCs w:val="32"/>
+              </w:rPr>
+              <w:t>Krama Vaakyam No.-</w:t>
+            </w:r>
+            <w:r>
+              <w:rPr>
+                <w:rFonts w:cs="Arial"/>
+                <w:b/>
+                <w:color w:val="000000"/>
+                <w:sz w:val="28"/>
+                <w:szCs w:val="32"/>
+              </w:rPr>
+              <w:t xml:space="preserve"> </w:t>
+            </w:r>
+            <w:r>
+              <w:rPr>
+                <w:rFonts w:cs="Arial"/>
+                <w:b/>
+                <w:color w:val="000000"/>
+                <w:sz w:val="28"/>
+                <w:szCs w:val="32"/>
+              </w:rPr>
+              <w:t>18</w:t>
+            </w:r>
+          </w:p>
+          <w:p>
+            <w:pPr>
+              <w:widowControl w:val="0"/>
+              <w:tabs>
+                <w:tab w:val="left" w:pos="993"/>
+              </w:tabs>
+              <w:autoSpaceDE w:val="0"/>
+              <w:autoSpaceDN w:val="0"/>
+              <w:adjustRightInd w:val="0"/>
+              <w:spacing w:before="0" w:line="240" w:lineRule="auto"/>
+              <w:ind w:right="297"/>
+              <w:rPr>
+                <w:rFonts w:cs="Arial"/>
+                <w:b/>
+                <w:color w:val="000000"/>
+                <w:sz w:val="28"/>
+                <w:szCs w:val="32"/>
+              </w:rPr>
+            </w:pPr>
+            <w:r>
+              <w:rPr>
+                <w:rFonts w:cs="Arial"/>
+                <w:b/>
+                <w:color w:val="000000"/>
+                <w:sz w:val="28"/>
+                <w:szCs w:val="32"/>
+              </w:rPr>
+              <w:t>Panchaati No</w:t>
+            </w:r>
+            <w:r>
+              <w:rPr>
+                <w:rFonts w:cs="Arial"/>
+                <w:b/>
+                <w:color w:val="000000"/>
+                <w:szCs w:val="32"/>
+              </w:rPr>
+              <w:t>. -</w:t>
+            </w:r>
+            <w:r>
+              <w:rPr>
+                <w:rFonts w:cs="Arial"/>
+                <w:b/>
+                <w:color w:val="000000"/>
+                <w:sz w:val="28"/>
+                <w:szCs w:val="36"/>
+              </w:rPr>
+              <w:t xml:space="preserve"> 62</w:t>
+            </w:r>
+          </w:p>
+        </w:tc>
+        <w:tc>
+          <w:tcPr>
+            <w:tcW w:w="5386" w:type="dxa"/>
+          </w:tcPr>
+          <w:p>
+            <w:pPr>
+              <w:widowControl w:val="0"/>
+              <w:autoSpaceDE w:val="0"/>
+              <w:autoSpaceDN w:val="0"/>
+              <w:adjustRightInd w:val="0"/>
+              <w:spacing w:before="0" w:line="240" w:lineRule="auto"/>
+              <w:rPr>
+                <w:rFonts w:ascii="Latha" w:hAnsi="Latha" w:cs="Latha"/>
+                <w:sz w:val="28"/>
+                <w:szCs w:val="28"/>
+                <w:cs/>
+                <w:lang w:bidi="ta-IN"/>
+              </w:rPr>
+            </w:pPr>
+            <w:r>
+              <w:rPr>
+                <w:rFonts w:ascii="Latha" w:hAnsi="Latha" w:cs="Latha"/>
+                <w:sz w:val="28"/>
+                <w:szCs w:val="28"/>
+                <w:cs/>
+                <w:lang w:bidi="ta-IN"/>
+              </w:rPr>
+              <w:t>ஸேன</w:t>
+            </w:r>
+            <w:r>
+              <w:rPr>
+                <w:rFonts w:ascii="BRH Tamil Tab Extra" w:hAnsi="BRH Tamil Tab Extra" w:cs="Latha"/>
+                <w:b/>
+                <w:sz w:val="36"/>
+                <w:szCs w:val="28"/>
+                <w:lang w:bidi="ta-IN"/>
+              </w:rPr>
+              <w:t>†</w:t>
+            </w:r>
+            <w:r>
+              <w:rPr>
+                <w:rFonts w:ascii="Latha" w:hAnsi="Latha" w:cs="Latha"/>
+                <w:sz w:val="28"/>
+                <w:szCs w:val="28"/>
+                <w:cs/>
+                <w:lang w:bidi="ta-IN"/>
+              </w:rPr>
+              <w:t>யா</w:t>
+            </w:r>
+            <w:r>
+              <w:rPr>
+                <w:rFonts w:ascii="BRH Tamil Tab Extra" w:hAnsi="BRH Tamil Tab Extra" w:cs="Latha"/>
+                <w:b/>
+                <w:sz w:val="32"/>
+                <w:szCs w:val="28"/>
+                <w:lang w:bidi="ta-IN"/>
+              </w:rPr>
+              <w:t>…</w:t>
+            </w:r>
+            <w:r>
+              <w:rPr>
+                <w:rFonts w:ascii="BRH Devanagari Extra" w:hAnsi="BRH Devanagari Extra" w:cs="Latha"/>
+                <w:b/>
+                <w:sz w:val="36"/>
+                <w:szCs w:val="28"/>
+                <w:lang w:bidi="ta-IN"/>
+              </w:rPr>
+              <w:t>Å</w:t>
+            </w:r>
+            <w:r>
+              <w:rPr>
+                <w:rFonts w:ascii="Latha" w:hAnsi="Latha" w:cs="Latha"/>
+                <w:sz w:val="28"/>
+                <w:szCs w:val="28"/>
+                <w:cs/>
+                <w:lang w:bidi="ta-IN"/>
+              </w:rPr>
+              <w:t>க்</w:t>
+            </w:r>
+            <w:r>
+              <w:rPr>
+                <w:rFonts w:ascii="Latha" w:hAnsi="Latha" w:cs="Latha"/>
+                <w:b/>
+                <w:bCs/>
+                <w:position w:val="-12"/>
+                <w:sz w:val="28"/>
+                <w:szCs w:val="28"/>
+                <w:cs/>
+                <w:lang w:bidi="ta-IN"/>
+              </w:rPr>
+              <w:t>3</w:t>
+            </w:r>
+            <w:r>
+              <w:rPr>
+                <w:rFonts w:ascii="Latha" w:hAnsi="Latha" w:cs="Latha"/>
+                <w:sz w:val="28"/>
+                <w:szCs w:val="28"/>
+                <w:cs/>
+                <w:lang w:bidi="ta-IN"/>
+              </w:rPr>
+              <w:t>னே</w:t>
+            </w:r>
+            <w:r>
+              <w:rPr>
+                <w:rFonts w:ascii="Latha" w:hAnsi="Latha" w:cs="Latha"/>
+                <w:b/>
+                <w:bCs/>
+                <w:sz w:val="32"/>
+                <w:szCs w:val="32"/>
+                <w:cs/>
+                <w:lang w:bidi="ta-IN"/>
+              </w:rPr>
+              <w:t>:</w:t>
+            </w:r>
+            <w:r>
+              <w:rPr>
+                <w:rFonts w:ascii="Latha" w:hAnsi="Latha" w:cs="Latha"/>
+                <w:sz w:val="28"/>
+                <w:szCs w:val="28"/>
+                <w:cs/>
+                <w:lang w:bidi="ta-IN"/>
+              </w:rPr>
+              <w:t xml:space="preserve"> </w:t>
+            </w:r>
+            <w:r>
+              <w:rPr>
+                <w:rFonts w:ascii="Latha" w:hAnsi="Latha" w:cs="Latha"/>
+                <w:sz w:val="28"/>
+                <w:szCs w:val="28"/>
+                <w:lang w:bidi="ta-IN"/>
+              </w:rPr>
+              <w:t xml:space="preserve">| </w:t>
+            </w:r>
+            <w:r>
+              <w:rPr>
+                <w:rFonts w:ascii="Latha" w:hAnsi="Latha" w:cs="Latha"/>
+                <w:sz w:val="28"/>
+                <w:szCs w:val="28"/>
+                <w:cs/>
+                <w:lang w:bidi="ta-IN"/>
+              </w:rPr>
+              <w:br/>
+            </w:r>
+            <w:r>
+              <w:rPr>
+                <w:rFonts w:ascii="Latha" w:hAnsi="Latha" w:cs="Latha"/>
+                <w:sz w:val="28"/>
+                <w:szCs w:val="28"/>
+                <w:cs/>
+                <w:lang w:bidi="ta-IN"/>
+              </w:rPr>
+              <w:t>அ</w:t>
+            </w:r>
+            <w:r>
+              <w:rPr>
+                <w:rFonts w:ascii="BRH Tamil Tab Extra" w:hAnsi="BRH Tamil Tab Extra" w:cs="Latha"/>
+                <w:b/>
+                <w:sz w:val="32"/>
+                <w:szCs w:val="28"/>
+                <w:lang w:bidi="ta-IN"/>
+              </w:rPr>
+              <w:t>…</w:t>
+            </w:r>
+            <w:r>
+              <w:rPr>
+                <w:rFonts w:ascii="Latha" w:hAnsi="Latha" w:cs="Latha"/>
+                <w:sz w:val="28"/>
+                <w:szCs w:val="28"/>
+                <w:cs/>
+                <w:lang w:bidi="ta-IN"/>
+              </w:rPr>
+              <w:t>க்</w:t>
+            </w:r>
+            <w:r>
+              <w:rPr>
+                <w:rFonts w:ascii="Latha" w:hAnsi="Latha" w:cs="Latha"/>
+                <w:b/>
+                <w:bCs/>
+                <w:position w:val="-12"/>
+                <w:sz w:val="28"/>
+                <w:szCs w:val="28"/>
+                <w:cs/>
+                <w:lang w:bidi="ta-IN"/>
+              </w:rPr>
+              <w:t>3</w:t>
+            </w:r>
+            <w:r>
+              <w:rPr>
+                <w:rFonts w:ascii="Latha" w:hAnsi="Latha" w:cs="Latha"/>
+                <w:sz w:val="28"/>
+                <w:szCs w:val="28"/>
+                <w:cs/>
+                <w:lang w:bidi="ta-IN"/>
+              </w:rPr>
+              <w:t>னே</w:t>
+            </w:r>
+            <w:r>
+              <w:rPr>
+                <w:rFonts w:ascii="Latha" w:hAnsi="Latha" w:cs="Latha"/>
+                <w:sz w:val="28"/>
+                <w:szCs w:val="28"/>
+                <w:highlight w:val="yellow"/>
+                <w:cs/>
+                <w:lang w:bidi="ta-IN"/>
+              </w:rPr>
+              <w:t>ர் அ</w:t>
+            </w:r>
+            <w:r>
+              <w:rPr>
+                <w:rFonts w:ascii="Latha" w:hAnsi="Latha" w:cs="Latha"/>
+                <w:sz w:val="28"/>
+                <w:szCs w:val="28"/>
+                <w:cs/>
+                <w:lang w:bidi="ta-IN"/>
+              </w:rPr>
+              <w:t>பா</w:t>
+            </w:r>
+            <w:r>
+              <w:rPr>
+                <w:rFonts w:ascii="BRH Tamil Tab Extra" w:hAnsi="BRH Tamil Tab Extra" w:cs="Latha"/>
+                <w:b/>
+                <w:sz w:val="36"/>
+                <w:szCs w:val="28"/>
+                <w:lang w:bidi="ta-IN"/>
+              </w:rPr>
+              <w:t>†</w:t>
+            </w:r>
+            <w:r>
+              <w:rPr>
+                <w:rFonts w:ascii="Latha" w:hAnsi="Latha" w:cs="Latha"/>
+                <w:sz w:val="28"/>
+                <w:szCs w:val="28"/>
+                <w:cs/>
+                <w:lang w:bidi="ta-IN"/>
+              </w:rPr>
+              <w:t>கசக்ஷஸ</w:t>
+            </w:r>
+            <w:r>
+              <w:rPr>
+                <w:rFonts w:ascii="Latha" w:hAnsi="Latha" w:cs="Latha"/>
+                <w:b/>
+                <w:bCs/>
+                <w:sz w:val="32"/>
+                <w:szCs w:val="32"/>
+                <w:cs/>
+                <w:lang w:bidi="ta-IN"/>
+              </w:rPr>
+              <w:t>:</w:t>
+            </w:r>
+            <w:r>
+              <w:rPr>
+                <w:rFonts w:ascii="Latha" w:hAnsi="Latha" w:cs="Latha"/>
+                <w:sz w:val="28"/>
+                <w:szCs w:val="28"/>
+                <w:cs/>
+                <w:lang w:bidi="ta-IN"/>
+              </w:rPr>
+              <w:t xml:space="preserve"> </w:t>
+            </w:r>
+            <w:r>
+              <w:rPr>
+                <w:rFonts w:ascii="Latha" w:hAnsi="Latha" w:cs="Latha"/>
+                <w:sz w:val="28"/>
+                <w:szCs w:val="28"/>
+                <w:lang w:bidi="ta-IN"/>
+              </w:rPr>
+              <w:t>|</w:t>
+            </w:r>
+          </w:p>
+        </w:tc>
+        <w:tc>
+          <w:tcPr>
+            <w:tcW w:w="5220" w:type="dxa"/>
+          </w:tcPr>
+          <w:p>
+            <w:pPr>
+              <w:widowControl w:val="0"/>
+              <w:autoSpaceDE w:val="0"/>
+              <w:autoSpaceDN w:val="0"/>
+              <w:adjustRightInd w:val="0"/>
+              <w:spacing w:before="0" w:line="240" w:lineRule="auto"/>
+              <w:rPr>
+                <w:rFonts w:ascii="Latha" w:hAnsi="Latha" w:cs="Latha"/>
+                <w:sz w:val="28"/>
+                <w:szCs w:val="28"/>
+                <w:cs/>
+                <w:lang w:bidi="ta-IN"/>
+              </w:rPr>
+            </w:pPr>
+            <w:r>
+              <w:rPr>
+                <w:rFonts w:ascii="Latha" w:hAnsi="Latha" w:cs="Latha"/>
+                <w:sz w:val="28"/>
+                <w:szCs w:val="28"/>
+                <w:cs/>
+                <w:lang w:bidi="ta-IN"/>
+              </w:rPr>
+              <w:t>ஸேன</w:t>
+            </w:r>
+            <w:r>
+              <w:rPr>
+                <w:rFonts w:ascii="BRH Tamil Tab Extra" w:hAnsi="BRH Tamil Tab Extra" w:cs="Latha"/>
+                <w:b/>
+                <w:sz w:val="36"/>
+                <w:szCs w:val="28"/>
+                <w:lang w:bidi="ta-IN"/>
+              </w:rPr>
+              <w:t>†</w:t>
+            </w:r>
+            <w:r>
+              <w:rPr>
+                <w:rFonts w:ascii="Latha" w:hAnsi="Latha" w:cs="Latha"/>
+                <w:sz w:val="28"/>
+                <w:szCs w:val="28"/>
+                <w:cs/>
+                <w:lang w:bidi="ta-IN"/>
+              </w:rPr>
+              <w:t>யா</w:t>
+            </w:r>
+            <w:r>
+              <w:rPr>
+                <w:rFonts w:ascii="BRH Tamil Tab Extra" w:hAnsi="BRH Tamil Tab Extra" w:cs="Latha"/>
+                <w:b/>
+                <w:sz w:val="32"/>
+                <w:szCs w:val="28"/>
+                <w:lang w:bidi="ta-IN"/>
+              </w:rPr>
+              <w:t>…</w:t>
+            </w:r>
+            <w:r>
+              <w:rPr>
+                <w:rFonts w:ascii="BRH Devanagari Extra" w:hAnsi="BRH Devanagari Extra" w:cs="Latha"/>
+                <w:b/>
+                <w:sz w:val="36"/>
+                <w:szCs w:val="28"/>
+                <w:lang w:bidi="ta-IN"/>
+              </w:rPr>
+              <w:t>Å</w:t>
+            </w:r>
+            <w:r>
+              <w:rPr>
+                <w:rFonts w:ascii="Latha" w:hAnsi="Latha" w:cs="Latha"/>
+                <w:sz w:val="28"/>
+                <w:szCs w:val="28"/>
+                <w:cs/>
+                <w:lang w:bidi="ta-IN"/>
+              </w:rPr>
+              <w:t>க்</w:t>
+            </w:r>
+            <w:r>
+              <w:rPr>
+                <w:rFonts w:ascii="Latha" w:hAnsi="Latha" w:cs="Latha"/>
+                <w:b/>
+                <w:bCs/>
+                <w:position w:val="-12"/>
+                <w:sz w:val="28"/>
+                <w:szCs w:val="28"/>
+                <w:cs/>
+                <w:lang w:bidi="ta-IN"/>
+              </w:rPr>
+              <w:t>3</w:t>
+            </w:r>
+            <w:r>
+              <w:rPr>
+                <w:rFonts w:ascii="Latha" w:hAnsi="Latha" w:cs="Latha"/>
+                <w:sz w:val="28"/>
+                <w:szCs w:val="28"/>
+                <w:cs/>
+                <w:lang w:bidi="ta-IN"/>
+              </w:rPr>
+              <w:t>னே</w:t>
+            </w:r>
+            <w:r>
+              <w:rPr>
+                <w:rFonts w:ascii="Latha" w:hAnsi="Latha" w:cs="Latha"/>
+                <w:b/>
+                <w:bCs/>
+                <w:sz w:val="32"/>
+                <w:szCs w:val="32"/>
+                <w:cs/>
+                <w:lang w:bidi="ta-IN"/>
+              </w:rPr>
+              <w:t>:</w:t>
+            </w:r>
+            <w:r>
+              <w:rPr>
+                <w:rFonts w:ascii="Latha" w:hAnsi="Latha" w:cs="Latha"/>
+                <w:sz w:val="28"/>
+                <w:szCs w:val="28"/>
+                <w:cs/>
+                <w:lang w:bidi="ta-IN"/>
+              </w:rPr>
+              <w:t xml:space="preserve"> </w:t>
+            </w:r>
+            <w:r>
+              <w:rPr>
+                <w:rFonts w:ascii="Latha" w:hAnsi="Latha" w:cs="Latha"/>
+                <w:sz w:val="28"/>
+                <w:szCs w:val="28"/>
+                <w:lang w:bidi="ta-IN"/>
+              </w:rPr>
+              <w:t xml:space="preserve">| </w:t>
+            </w:r>
+            <w:r>
+              <w:rPr>
+                <w:rFonts w:ascii="Latha" w:hAnsi="Latha" w:cs="Latha"/>
+                <w:sz w:val="28"/>
+                <w:szCs w:val="28"/>
+                <w:cs/>
+                <w:lang w:bidi="ta-IN"/>
+              </w:rPr>
+              <w:br/>
+            </w:r>
+            <w:r>
+              <w:rPr>
+                <w:rFonts w:ascii="Latha" w:hAnsi="Latha" w:cs="Latha"/>
+                <w:sz w:val="28"/>
+                <w:szCs w:val="28"/>
+                <w:cs/>
+                <w:lang w:bidi="ta-IN"/>
+              </w:rPr>
+              <w:t>அ</w:t>
+            </w:r>
+            <w:r>
+              <w:rPr>
+                <w:rFonts w:ascii="BRH Tamil Tab Extra" w:hAnsi="BRH Tamil Tab Extra" w:cs="Latha"/>
+                <w:b/>
+                <w:sz w:val="32"/>
+                <w:szCs w:val="28"/>
+                <w:lang w:bidi="ta-IN"/>
+              </w:rPr>
+              <w:t>…</w:t>
+            </w:r>
+            <w:r>
+              <w:rPr>
+                <w:rFonts w:ascii="Latha" w:hAnsi="Latha" w:cs="Latha"/>
+                <w:sz w:val="28"/>
+                <w:szCs w:val="28"/>
+                <w:cs/>
+                <w:lang w:bidi="ta-IN"/>
+              </w:rPr>
+              <w:t>க்</w:t>
+            </w:r>
+            <w:r>
+              <w:rPr>
+                <w:rFonts w:ascii="Latha" w:hAnsi="Latha" w:cs="Latha"/>
+                <w:b/>
+                <w:bCs/>
+                <w:position w:val="-12"/>
+                <w:sz w:val="28"/>
+                <w:szCs w:val="28"/>
+                <w:cs/>
+                <w:lang w:bidi="ta-IN"/>
+              </w:rPr>
+              <w:t>3</w:t>
+            </w:r>
+            <w:r>
+              <w:rPr>
+                <w:rFonts w:ascii="Latha" w:hAnsi="Latha" w:cs="Latha"/>
+                <w:sz w:val="28"/>
+                <w:szCs w:val="28"/>
+                <w:cs/>
+                <w:lang w:bidi="ta-IN"/>
+              </w:rPr>
+              <w:t>னே</w:t>
+            </w:r>
+            <w:r>
+              <w:rPr>
+                <w:rFonts w:ascii="Latha" w:hAnsi="Latha" w:cs="Latha"/>
+                <w:sz w:val="28"/>
+                <w:szCs w:val="28"/>
+                <w:highlight w:val="green"/>
+                <w:cs/>
+                <w:lang w:bidi="ta-IN"/>
+              </w:rPr>
+              <w:t>ரபா</w:t>
+            </w:r>
+            <w:r>
+              <w:rPr>
+                <w:rFonts w:ascii="BRH Tamil Tab Extra" w:hAnsi="BRH Tamil Tab Extra" w:cs="Latha"/>
+                <w:b/>
+                <w:sz w:val="36"/>
+                <w:szCs w:val="28"/>
+                <w:highlight w:val="green"/>
+                <w:lang w:bidi="ta-IN"/>
+              </w:rPr>
+              <w:t>†</w:t>
+            </w:r>
+            <w:r>
+              <w:rPr>
+                <w:rFonts w:ascii="Latha" w:hAnsi="Latha" w:cs="Latha"/>
+                <w:sz w:val="28"/>
+                <w:szCs w:val="28"/>
+                <w:cs/>
+                <w:lang w:bidi="ta-IN"/>
+              </w:rPr>
+              <w:t>கசக்ஷஸ</w:t>
+            </w:r>
+            <w:r>
+              <w:rPr>
+                <w:rFonts w:ascii="Latha" w:hAnsi="Latha" w:cs="Latha"/>
+                <w:b/>
+                <w:bCs/>
+                <w:sz w:val="32"/>
+                <w:szCs w:val="32"/>
+                <w:cs/>
+                <w:lang w:bidi="ta-IN"/>
+              </w:rPr>
+              <w:t>:</w:t>
+            </w:r>
+            <w:r>
+              <w:rPr>
+                <w:rFonts w:ascii="Latha" w:hAnsi="Latha" w:cs="Latha"/>
+                <w:sz w:val="28"/>
+                <w:szCs w:val="28"/>
+                <w:cs/>
+                <w:lang w:bidi="ta-IN"/>
+              </w:rPr>
+              <w:t xml:space="preserve"> </w:t>
+            </w:r>
+            <w:r>
+              <w:rPr>
+                <w:rFonts w:ascii="Latha" w:hAnsi="Latha" w:cs="Latha"/>
+                <w:sz w:val="28"/>
+                <w:szCs w:val="28"/>
+                <w:lang w:bidi="ta-IN"/>
+              </w:rPr>
+              <w:t>|</w:t>
+            </w:r>
+          </w:p>
+        </w:tc>
+      </w:tr>
     </w:tbl>
-    <w:p>
-      <w:pPr>
-        <w:jc w:val="center"/>
-        <w:rPr>
-          <w:b/>
-          <w:bCs/>
-          <w:sz w:val="32"/>
-          <w:szCs w:val="32"/>
-          <w:u w:val="single"/>
-        </w:rPr>
-      </w:pPr>
-    </w:p>
-    <w:p>
-      <w:pPr>
-        <w:jc w:val="center"/>
-        <w:rPr>
-          <w:b/>
-          <w:bCs/>
-          <w:sz w:val="32"/>
-          <w:szCs w:val="32"/>
-          <w:u w:val="single"/>
-        </w:rPr>
-      </w:pPr>
-    </w:p>
-    <w:p>
-      <w:pPr>
-        <w:jc w:val="center"/>
-        <w:rPr>
-          <w:b/>
-          <w:bCs/>
-          <w:sz w:val="32"/>
-          <w:szCs w:val="32"/>
-          <w:u w:val="single"/>
-        </w:rPr>
-      </w:pPr>
-    </w:p>
     <w:p>
       <w:pPr>
         <w:jc w:val="center"/>
@@ -2127,7 +5870,6 @@
                 <w:sz w:val="28"/>
                 <w:szCs w:val="32"/>
               </w:rPr>
-              <w:lastRenderedPageBreak/>
               <w:t>T.S.2.</w:t>
             </w:r>
             <w:r>
@@ -3408,6 +7150,7 @@
                 <w:cs/>
                 <w:lang w:bidi="ta-IN"/>
               </w:rPr>
+              <w:lastRenderedPageBreak/>
               <w:t>ப</w:t>
             </w:r>
             <w:r>
@@ -3562,6 +7305,7 @@
                 <w:cs/>
                 <w:lang w:bidi="ta-IN"/>
               </w:rPr>
+              <w:lastRenderedPageBreak/>
               <w:t>ஸோ</w:t>
             </w:r>
             <w:r>
@@ -3612,6 +7356,7 @@
                 <w:cs/>
                 <w:lang w:bidi="ta-IN"/>
               </w:rPr>
+              <w:lastRenderedPageBreak/>
               <w:t>ப</w:t>
             </w:r>
             <w:r>
@@ -3754,6 +7499,7 @@
                 <w:sz w:val="28"/>
                 <w:szCs w:val="32"/>
               </w:rPr>
+              <w:lastRenderedPageBreak/>
               <w:t>T.S.2.</w:t>
             </w:r>
             <w:r>
@@ -4480,6 +8226,90 @@
         </w:tc>
       </w:tr>
     </w:tbl>
+    <w:p>
+      <w:pPr>
+        <w:jc w:val="center"/>
+        <w:rPr>
+          <w:b/>
+          <w:bCs/>
+          <w:sz w:val="32"/>
+          <w:szCs w:val="32"/>
+          <w:u w:val="single"/>
+        </w:rPr>
+      </w:pPr>
+    </w:p>
+    <w:p>
+      <w:pPr>
+        <w:jc w:val="center"/>
+        <w:rPr>
+          <w:b/>
+          <w:bCs/>
+          <w:sz w:val="32"/>
+          <w:szCs w:val="32"/>
+          <w:u w:val="single"/>
+        </w:rPr>
+      </w:pPr>
+    </w:p>
+    <w:p>
+      <w:pPr>
+        <w:jc w:val="center"/>
+        <w:rPr>
+          <w:b/>
+          <w:bCs/>
+          <w:sz w:val="32"/>
+          <w:szCs w:val="32"/>
+          <w:u w:val="single"/>
+        </w:rPr>
+      </w:pPr>
+    </w:p>
+    <w:p>
+      <w:pPr>
+        <w:jc w:val="center"/>
+        <w:rPr>
+          <w:b/>
+          <w:bCs/>
+          <w:sz w:val="32"/>
+          <w:szCs w:val="32"/>
+          <w:u w:val="single"/>
+        </w:rPr>
+      </w:pPr>
+    </w:p>
+    <w:p>
+      <w:pPr>
+        <w:jc w:val="center"/>
+        <w:rPr>
+          <w:b/>
+          <w:bCs/>
+          <w:sz w:val="32"/>
+          <w:szCs w:val="32"/>
+          <w:u w:val="single"/>
+        </w:rPr>
+      </w:pPr>
+    </w:p>
+    <w:p>
+      <w:pPr>
+        <w:jc w:val="center"/>
+        <w:rPr>
+          <w:b/>
+          <w:bCs/>
+          <w:sz w:val="32"/>
+          <w:szCs w:val="32"/>
+          <w:u w:val="single"/>
+        </w:rPr>
+      </w:pPr>
+    </w:p>
+    <w:p>
+      <w:pPr>
+        <w:jc w:val="center"/>
+        <w:rPr>
+          <w:b/>
+          <w:bCs/>
+          <w:sz w:val="32"/>
+          <w:szCs w:val="32"/>
+          <w:u w:val="single"/>
+        </w:rPr>
+      </w:pPr>
+    </w:p>
     <w:p>
       <w:pPr>
         <w:jc w:val="center"/>
@@ -17803,6 +21633,42 @@
           <w:u w:val="single"/>
         </w:rPr>
       </w:pPr>
+    </w:p>
+    <w:p>
+      <w:pPr>
+        <w:jc w:val="center"/>
+        <w:rPr>
+          <w:b/>
+          <w:bCs/>
+          <w:sz w:val="32"/>
+          <w:szCs w:val="32"/>
+          <w:u w:val="single"/>
+        </w:rPr>
+      </w:pPr>
+    </w:p>
+    <w:p>
+      <w:pPr>
+        <w:jc w:val="center"/>
+        <w:rPr>
+          <w:b/>
+          <w:bCs/>
+          <w:sz w:val="32"/>
+          <w:szCs w:val="32"/>
+          <w:u w:val="single"/>
+        </w:rPr>
+      </w:pPr>
+    </w:p>
+    <w:p>
+      <w:pPr>
+        <w:jc w:val="center"/>
+        <w:rPr>
+          <w:b/>
+          <w:bCs/>
+          <w:sz w:val="32"/>
+          <w:szCs w:val="32"/>
+          <w:u w:val="single"/>
+        </w:rPr>
+      </w:pPr>
       <w:r>
         <w:rPr>
           <w:b/>
@@ -17811,6 +21677,7 @@
           <w:szCs w:val="32"/>
           <w:u w:val="single"/>
         </w:rPr>
+        <w:lastRenderedPageBreak/>
         <w:t xml:space="preserve">TS </w:t>
       </w:r>
       <w:r>
@@ -18066,7 +21933,6 @@
                 <w:sz w:val="28"/>
                 <w:szCs w:val="28"/>
               </w:rPr>
-              <w:lastRenderedPageBreak/>
               <w:t>T.S.2.</w:t>
             </w:r>
             <w:r>
@@ -20354,6 +24220,7 @@
                 <w:sz w:val="28"/>
                 <w:szCs w:val="28"/>
               </w:rPr>
+              <w:lastRenderedPageBreak/>
               <w:t>T.S.2.</w:t>
             </w:r>
             <w:r>
@@ -21451,7 +25318,6 @@
                 <w:sz w:val="28"/>
                 <w:szCs w:val="28"/>
               </w:rPr>
-              <w:lastRenderedPageBreak/>
               <w:t>T.S.2.</w:t>
             </w:r>
             <w:r>
@@ -21498,6 +25364,7 @@
               </w:rPr>
               <w:t xml:space="preserve"> – </w:t>
             </w:r>
+            <w:proofErr w:type="spellStart"/>
             <w:r>
               <w:rPr>
                 <w:rFonts w:cs="Arial"/>
@@ -21520,6 +25387,7 @@
               </w:rPr>
               <w:t>ramam</w:t>
             </w:r>
+            <w:proofErr w:type="spellEnd"/>
           </w:p>
           <w:p>
             <w:pPr>
@@ -22046,20 +25914,6 @@
       <w:pPr>
         <w:jc w:val="center"/>
       </w:pPr>
-      <w:r>
-        <w:rPr>
-          <w:b/>
-          <w:bCs/>
-          <w:sz w:val="32"/>
-          <w:szCs w:val="32"/>
-          <w:u w:val="single"/>
-        </w:rPr>
-        <w:br w:type="page"/>
-      </w:r>
-      <w:r>
-        <w:lastRenderedPageBreak/>
-        <w:t xml:space="preserve"> </w:t>
-      </w:r>
     </w:p>
     <w:sectPr>
       <w:headerReference w:type="even" r:id="rId7"/>
@@ -22942,7 +26796,7 @@
   <w:style w:type="paragraph" w:default="1" w:styleId="Normal">
     <w:name w:val="Normal"/>
     <w:qFormat/>
-    <w:rsid w:val="00076C05"/>
+    <w:rsid w:val="005C53FC"/>
     <w:pPr>
       <w:spacing w:before="120" w:line="276" w:lineRule="auto"/>
     </w:pPr>

</xml_diff>